<commit_message>
working through redoing of sales data
</commit_message>
<xml_diff>
--- a/Claude_artifacts.docx
+++ b/Claude_artifacts.docx
@@ -4160,7 +4160,3508 @@
         <w:t>print(f"Date range: {dates[0].date()} to {dates[-1].date()}")</w:t>
       </w:r>
     </w:p>
+    <w:p>
+      <w:pPr>
+        <w:pStyle w:val="whitespace-pre-wrap"/>
+        <w:rPr>
+          <w:b/>
+          <w:bCs/>
+        </w:rPr>
+      </w:pPr>
+    </w:p>
+    <w:p>
+      <w:pPr>
+        <w:pStyle w:val="whitespace-pre-wrap"/>
+        <w:rPr>
+          <w:rFonts w:ascii="Segoe UI" w:hAnsi="Segoe UI" w:cs="Segoe UI"/>
+          <w:color w:val="141413"/>
+          <w:shd w:val="clear" w:color="auto" w:fill="F0EEE6"/>
+        </w:rPr>
+      </w:pPr>
+      <w:r>
+        <w:rPr>
+          <w:b/>
+          <w:bCs/>
+        </w:rPr>
+        <w:t xml:space="preserve">My prompt: </w:t>
+      </w:r>
+      <w:r>
+        <w:rPr>
+          <w:rFonts w:ascii="Segoe UI" w:hAnsi="Segoe UI" w:cs="Segoe UI"/>
+          <w:color w:val="141413"/>
+          <w:shd w:val="clear" w:color="auto" w:fill="F0EEE6"/>
+        </w:rPr>
+        <w:t>how to Fetch "External Drivers" from OpenWeatherMap (Free Tier: 1,000 calls/day). python</w:t>
+      </w:r>
+      <w:r>
+        <w:rPr>
+          <w:rFonts w:ascii="Segoe UI" w:hAnsi="Segoe UI" w:cs="Segoe UI"/>
+          <w:color w:val="141413"/>
+          <w:shd w:val="clear" w:color="auto" w:fill="F0EEE6"/>
+        </w:rPr>
+        <w:t xml:space="preserve">, then I amended: </w:t>
+      </w:r>
+      <w:r>
+        <w:rPr>
+          <w:rFonts w:ascii="Segoe UI" w:hAnsi="Segoe UI" w:cs="Segoe UI"/>
+          <w:color w:val="141413"/>
+          <w:shd w:val="clear" w:color="auto" w:fill="F0EEE6"/>
+        </w:rPr>
+        <w:t>for 3 months of just temps, sky/precipitation</w:t>
+      </w:r>
+    </w:p>
+    <w:p>
+      <w:pPr>
+        <w:pStyle w:val="font-claude-response-body"/>
+      </w:pPr>
+      <w:r>
+        <w:t>Claude</w:t>
+      </w:r>
+      <w:r>
+        <w:t xml:space="preserve">: </w:t>
+      </w:r>
+      <w:r>
+        <w:t>Here's a focused script for pulling 3 months of temperature + sky/precipitation data:</w:t>
+      </w:r>
+    </w:p>
+    <w:p>
+      <w:pPr>
+        <w:spacing w:before="100" w:beforeAutospacing="1" w:after="100" w:afterAutospacing="1" w:line="240" w:lineRule="auto"/>
+        <w:outlineLvl w:val="1"/>
+        <w:rPr>
+          <w:rFonts w:ascii="Times New Roman" w:eastAsia="Times New Roman" w:hAnsi="Times New Roman" w:cs="Times New Roman"/>
+          <w:b/>
+          <w:bCs/>
+          <w:kern w:val="0"/>
+          <w:sz w:val="36"/>
+          <w:szCs w:val="36"/>
+          <w14:ligatures w14:val="none"/>
+        </w:rPr>
+      </w:pPr>
+      <w:r>
+        <w:rPr>
+          <w:rFonts w:ascii="Times New Roman" w:eastAsia="Times New Roman" w:hAnsi="Times New Roman" w:cs="Times New Roman"/>
+          <w:b/>
+          <w:bCs/>
+          <w:kern w:val="0"/>
+          <w:sz w:val="36"/>
+          <w:szCs w:val="36"/>
+          <w14:ligatures w14:val="none"/>
+        </w:rPr>
+        <w:t>The Problem First</w:t>
+      </w:r>
+    </w:p>
+    <w:p>
+      <w:pPr>
+        <w:spacing w:before="100" w:beforeAutospacing="1" w:after="100" w:afterAutospacing="1" w:line="240" w:lineRule="auto"/>
+        <w:rPr>
+          <w:rFonts w:ascii="Times New Roman" w:eastAsia="Times New Roman" w:hAnsi="Times New Roman" w:cs="Times New Roman"/>
+          <w:kern w:val="0"/>
+          <w14:ligatures w14:val="none"/>
+        </w:rPr>
+      </w:pPr>
+      <w:r>
+        <w:rPr>
+          <w:rFonts w:ascii="Times New Roman" w:eastAsia="Times New Roman" w:hAnsi="Times New Roman" w:cs="Times New Roman"/>
+          <w:kern w:val="0"/>
+          <w14:ligatures w14:val="none"/>
+        </w:rPr>
+        <w:t xml:space="preserve">The free </w:t>
+      </w:r>
+      <w:r>
+        <w:rPr>
+          <w:rFonts w:ascii="Courier New" w:eastAsia="Times New Roman" w:hAnsi="Courier New" w:cs="Courier New"/>
+          <w:kern w:val="0"/>
+          <w:sz w:val="20"/>
+          <w:szCs w:val="20"/>
+          <w14:ligatures w14:val="none"/>
+        </w:rPr>
+        <w:t>/forecast</w:t>
+      </w:r>
+      <w:r>
+        <w:rPr>
+          <w:rFonts w:ascii="Times New Roman" w:eastAsia="Times New Roman" w:hAnsi="Times New Roman" w:cs="Times New Roman"/>
+          <w:kern w:val="0"/>
+          <w14:ligatures w14:val="none"/>
+        </w:rPr>
+        <w:t xml:space="preserve"> endpoint only gives </w:t>
+      </w:r>
+      <w:r>
+        <w:rPr>
+          <w:rFonts w:ascii="Times New Roman" w:eastAsia="Times New Roman" w:hAnsi="Times New Roman" w:cs="Times New Roman"/>
+          <w:b/>
+          <w:bCs/>
+          <w:kern w:val="0"/>
+          <w14:ligatures w14:val="none"/>
+        </w:rPr>
+        <w:t>5 days</w:t>
+      </w:r>
+      <w:r>
+        <w:rPr>
+          <w:rFonts w:ascii="Times New Roman" w:eastAsia="Times New Roman" w:hAnsi="Times New Roman" w:cs="Times New Roman"/>
+          <w:kern w:val="0"/>
+          <w14:ligatures w14:val="none"/>
+        </w:rPr>
+        <w:t xml:space="preserve">. For 3 months of historical data you need the </w:t>
+      </w:r>
+      <w:r>
+        <w:rPr>
+          <w:rFonts w:ascii="Times New Roman" w:eastAsia="Times New Roman" w:hAnsi="Times New Roman" w:cs="Times New Roman"/>
+          <w:b/>
+          <w:bCs/>
+          <w:kern w:val="0"/>
+          <w14:ligatures w14:val="none"/>
+        </w:rPr>
+        <w:t>History API</w:t>
+      </w:r>
+      <w:r>
+        <w:rPr>
+          <w:rFonts w:ascii="Times New Roman" w:eastAsia="Times New Roman" w:hAnsi="Times New Roman" w:cs="Times New Roman"/>
+          <w:kern w:val="0"/>
+          <w14:ligatures w14:val="none"/>
+        </w:rPr>
+        <w:t xml:space="preserve"> — but that's paid. The free workaround is to </w:t>
+      </w:r>
+      <w:r>
+        <w:rPr>
+          <w:rFonts w:ascii="Times New Roman" w:eastAsia="Times New Roman" w:hAnsi="Times New Roman" w:cs="Times New Roman"/>
+          <w:b/>
+          <w:bCs/>
+          <w:kern w:val="0"/>
+          <w14:ligatures w14:val="none"/>
+        </w:rPr>
+        <w:t>poll daily and store locally</w:t>
+      </w:r>
+      <w:r>
+        <w:rPr>
+          <w:rFonts w:ascii="Times New Roman" w:eastAsia="Times New Roman" w:hAnsi="Times New Roman" w:cs="Times New Roman"/>
+          <w:kern w:val="0"/>
+          <w14:ligatures w14:val="none"/>
+        </w:rPr>
+        <w:t>.</w:t>
+      </w:r>
+    </w:p>
+    <w:p>
+      <w:pPr>
+        <w:spacing w:before="100" w:beforeAutospacing="1" w:after="100" w:afterAutospacing="1" w:line="240" w:lineRule="auto"/>
+        <w:rPr>
+          <w:rFonts w:ascii="Times New Roman" w:eastAsia="Times New Roman" w:hAnsi="Times New Roman" w:cs="Times New Roman"/>
+          <w:kern w:val="0"/>
+          <w14:ligatures w14:val="none"/>
+        </w:rPr>
+      </w:pPr>
+      <w:r>
+        <w:t>Option A — Backfill via Free "One Call 3.0" Timemachine (pay-per-call after 1k)</w:t>
+      </w:r>
+    </w:p>
+    <w:p>
+      <w:r>
+        <w:t>.</w:t>
+      </w:r>
+      <w:r>
+        <w:t xml:space="preserve"> </w:t>
+      </w:r>
+      <w:r>
+        <w:t>import requests, os, time, json</w:t>
+      </w:r>
+    </w:p>
+    <w:p>
+      <w:r>
+        <w:t>from datetime import datetime, timedelta</w:t>
+      </w:r>
+    </w:p>
+    <w:p>
+      <w:r>
+        <w:t>from pathlib import Path</w:t>
+      </w:r>
+    </w:p>
     <w:p/>
+    <w:p>
+      <w:r>
+        <w:t>API_KEY  = os.environ["OWM_KEY"]</w:t>
+      </w:r>
+    </w:p>
+    <w:p>
+      <w:r>
+        <w:t>LAT, LON = 37.4419, -122.1430   # Palo Alto</w:t>
+      </w:r>
+    </w:p>
+    <w:p>
+      <w:r>
+        <w:t>OUT_DIR  = Path("weather_history")</w:t>
+      </w:r>
+    </w:p>
+    <w:p>
+      <w:r>
+        <w:t>OUT_DIR.mkdir(exist_ok=True)</w:t>
+      </w:r>
+    </w:p>
+    <w:p/>
+    <w:p>
+      <w:r>
+        <w:t>def fetch_day(dt: datetime) -&gt; dict:</w:t>
+      </w:r>
+    </w:p>
+    <w:p>
+      <w:r>
+        <w:t xml:space="preserve">    unix_ts = int(dt.timestamp())</w:t>
+      </w:r>
+    </w:p>
+    <w:p>
+      <w:r>
+        <w:t xml:space="preserve">    url = "https://api.openweathermap.org/data/3.0/onecall/timemachine"</w:t>
+      </w:r>
+    </w:p>
+    <w:p>
+      <w:r>
+        <w:t xml:space="preserve">    params = {"lat": LAT, "lon": LON, "dt": unix_ts,</w:t>
+      </w:r>
+    </w:p>
+    <w:p>
+      <w:r>
+        <w:t xml:space="preserve">              "appid": API_KEY, "units": "metric"}</w:t>
+      </w:r>
+    </w:p>
+    <w:p>
+      <w:r>
+        <w:t xml:space="preserve">    r = requests.get(url, params=params)</w:t>
+      </w:r>
+    </w:p>
+    <w:p>
+      <w:r>
+        <w:t xml:space="preserve">    r.raise_for_status()</w:t>
+      </w:r>
+    </w:p>
+    <w:p>
+      <w:r>
+        <w:t xml:space="preserve">    return r.json()</w:t>
+      </w:r>
+    </w:p>
+    <w:p/>
+    <w:p>
+      <w:r>
+        <w:t>def extract(day_data: dict) -&gt; list[dict]:</w:t>
+      </w:r>
+    </w:p>
+    <w:p>
+      <w:r>
+        <w:t xml:space="preserve">    rows = []</w:t>
+      </w:r>
+    </w:p>
+    <w:p>
+      <w:r>
+        <w:t xml:space="preserve">    for h in day_data.get("data", []):</w:t>
+      </w:r>
+    </w:p>
+    <w:p>
+      <w:r>
+        <w:t xml:space="preserve">        rows.append({</w:t>
+      </w:r>
+    </w:p>
+    <w:p>
+      <w:r>
+        <w:t xml:space="preserve">            "dt":          datetime.utcfromtimestamp(h["dt"]).isoformat(),</w:t>
+      </w:r>
+    </w:p>
+    <w:p>
+      <w:r>
+        <w:t xml:space="preserve">            "temp":        h["temp"],</w:t>
+      </w:r>
+    </w:p>
+    <w:p>
+      <w:r>
+        <w:t xml:space="preserve">            "feels_like":  h["feels_like"],</w:t>
+      </w:r>
+    </w:p>
+    <w:p>
+      <w:r>
+        <w:t xml:space="preserve">            "temp_min":    h.get("temp_min"),   # not always present hourly</w:t>
+      </w:r>
+    </w:p>
+    <w:p>
+      <w:r>
+        <w:t xml:space="preserve">            "temp_max":    h.get("temp_max"),</w:t>
+      </w:r>
+    </w:p>
+    <w:p>
+      <w:r>
+        <w:t xml:space="preserve">            "clouds":      h.get("clouds"),     # % coverage</w:t>
+      </w:r>
+    </w:p>
+    <w:p>
+      <w:r>
+        <w:t xml:space="preserve">            "rain_1h":     h.get("rain", 0),    # mm</w:t>
+      </w:r>
+    </w:p>
+    <w:p>
+      <w:r>
+        <w:lastRenderedPageBreak/>
+        <w:t xml:space="preserve">            "snow_1h":     h.get("snow", 0),    # mm</w:t>
+      </w:r>
+    </w:p>
+    <w:p>
+      <w:r>
+        <w:t xml:space="preserve">            "condition":   h["weather"][0]["main"],         # "Rain", "Snow"…</w:t>
+      </w:r>
+    </w:p>
+    <w:p>
+      <w:r>
+        <w:t xml:space="preserve">            "description": h["weather"][0]["description"],</w:t>
+      </w:r>
+    </w:p>
+    <w:p>
+      <w:r>
+        <w:t xml:space="preserve">        })</w:t>
+      </w:r>
+    </w:p>
+    <w:p>
+      <w:r>
+        <w:t xml:space="preserve">    return rows</w:t>
+      </w:r>
+    </w:p>
+    <w:p/>
+    <w:p>
+      <w:r>
+        <w:t># --- backfill last 90 days ---</w:t>
+      </w:r>
+    </w:p>
+    <w:p>
+      <w:r>
+        <w:t>all_rows = []</w:t>
+      </w:r>
+    </w:p>
+    <w:p>
+      <w:r>
+        <w:t>today    = datetime.utcnow().replace(hour=12, minute=0, second=0)</w:t>
+      </w:r>
+    </w:p>
+    <w:p/>
+    <w:p>
+      <w:r>
+        <w:t>for days_back in range(90, 0, -1):</w:t>
+      </w:r>
+    </w:p>
+    <w:p>
+      <w:r>
+        <w:t xml:space="preserve">    target = today - timedelta(days=days_back)</w:t>
+      </w:r>
+    </w:p>
+    <w:p>
+      <w:r>
+        <w:t xml:space="preserve">    fname  = OUT_DIR / f"{target.date()}.json"</w:t>
+      </w:r>
+    </w:p>
+    <w:p/>
+    <w:p>
+      <w:r>
+        <w:t xml:space="preserve">    if fname.exists():                      # skip already-fetched days</w:t>
+      </w:r>
+    </w:p>
+    <w:p>
+      <w:r>
+        <w:t xml:space="preserve">        with open(fname) as f:</w:t>
+      </w:r>
+    </w:p>
+    <w:p>
+      <w:r>
+        <w:t xml:space="preserve">            rows = json.load(f)</w:t>
+      </w:r>
+    </w:p>
+    <w:p>
+      <w:r>
+        <w:t xml:space="preserve">    else:</w:t>
+      </w:r>
+    </w:p>
+    <w:p>
+      <w:r>
+        <w:t xml:space="preserve">        raw  = fetch_day(target)</w:t>
+      </w:r>
+    </w:p>
+    <w:p>
+      <w:r>
+        <w:t xml:space="preserve">        rows = extract(raw)</w:t>
+      </w:r>
+    </w:p>
+    <w:p>
+      <w:r>
+        <w:t xml:space="preserve">        with open(fname, "w") as f:</w:t>
+      </w:r>
+    </w:p>
+    <w:p>
+      <w:r>
+        <w:t xml:space="preserve">            json.dump(rows, f)</w:t>
+      </w:r>
+    </w:p>
+    <w:p>
+      <w:r>
+        <w:t xml:space="preserve">        time.sleep(1.2)                     # ~72 calls/day budget friendly</w:t>
+      </w:r>
+    </w:p>
+    <w:p/>
+    <w:p>
+      <w:r>
+        <w:t xml:space="preserve">    all_rows.extend(rows)</w:t>
+      </w:r>
+    </w:p>
+    <w:p>
+      <w:r>
+        <w:t xml:space="preserve">    print(f"{target.date()} — {len(rows)} hourly records")</w:t>
+      </w:r>
+    </w:p>
+    <w:p/>
+    <w:p>
+      <w:r>
+        <w:t>print(f"\nTotal rows: {len(all_rows)}")Option B — Meteostat (completely free, no key needed)</w:t>
+      </w:r>
+      <w:r>
+        <w:t xml:space="preserve"> </w:t>
+      </w:r>
+    </w:p>
+    <w:p>
+      <w:r>
+        <w:t>pip install meteostat pandas</w:t>
+      </w:r>
+    </w:p>
+    <w:p>
+      <w:r>
+        <w:t>from meteostat import Point, Hourly, Daily</w:t>
+      </w:r>
+    </w:p>
+    <w:p>
+      <w:r>
+        <w:t>from datetime import datetime</w:t>
+      </w:r>
+    </w:p>
+    <w:p>
+      <w:r>
+        <w:t>import pandas as pd</w:t>
+      </w:r>
+    </w:p>
+    <w:p/>
+    <w:p>
+      <w:r>
+        <w:t>loc   = Point(37.4419, -122.1430)   # Palo Alto</w:t>
+      </w:r>
+    </w:p>
+    <w:p>
+      <w:r>
+        <w:t>start = datetime(2024, 12, 1)</w:t>
+      </w:r>
+    </w:p>
+    <w:p>
+      <w:r>
+        <w:t>end   = datetime(2025, 3, 1)</w:t>
+      </w:r>
+    </w:p>
+    <w:p/>
+    <w:p>
+      <w:r>
+        <w:t># --- Hourly ---</w:t>
+      </w:r>
+    </w:p>
+    <w:p>
+      <w:r>
+        <w:t>hourly = Hourly(loc, start, end).fetch()</w:t>
+      </w:r>
+    </w:p>
+    <w:p/>
+    <w:p>
+      <w:r>
+        <w:t>drivers = hourly[[</w:t>
+      </w:r>
+    </w:p>
+    <w:p>
+      <w:r>
+        <w:t xml:space="preserve">    "temp",    # °C</w:t>
+      </w:r>
+    </w:p>
+    <w:p>
+      <w:r>
+        <w:t xml:space="preserve">    "dwpt",    # dew point °C</w:t>
+      </w:r>
+    </w:p>
+    <w:p>
+      <w:r>
+        <w:t xml:space="preserve">    "prcp",    # precipitation mm</w:t>
+      </w:r>
+    </w:p>
+    <w:p>
+      <w:r>
+        <w:t xml:space="preserve">    "snow",    # snow depth mm</w:t>
+      </w:r>
+    </w:p>
+    <w:p>
+      <w:r>
+        <w:t xml:space="preserve">    "coco",    # WMO weather condition code</w:t>
+      </w:r>
+    </w:p>
+    <w:p>
+      <w:r>
+        <w:t>]].copy()</w:t>
+      </w:r>
+    </w:p>
+    <w:p/>
+    <w:p>
+      <w:r>
+        <w:t>drivers.index.name = "datetime"</w:t>
+      </w:r>
+    </w:p>
+    <w:p>
+      <w:r>
+        <w:t>print(drivers.head(10))</w:t>
+      </w:r>
+    </w:p>
+    <w:p>
+      <w:r>
+        <w:t>drivers.to_csv("palo_alto_3mo_hourly.csv")</w:t>
+      </w:r>
+    </w:p>
+    <w:p/>
+    <w:p>
+      <w:r>
+        <w:t># --- Daily summary (cleaner for most use cases) ---</w:t>
+      </w:r>
+    </w:p>
+    <w:p>
+      <w:r>
+        <w:t>daily = Daily(loc, start, end).fetch()</w:t>
+      </w:r>
+    </w:p>
+    <w:p/>
+    <w:p>
+      <w:r>
+        <w:t>summary = daily[[</w:t>
+      </w:r>
+    </w:p>
+    <w:p>
+      <w:r>
+        <w:t xml:space="preserve">    "tmin", "tmax", "tavg",   # temps</w:t>
+      </w:r>
+    </w:p>
+    <w:p>
+      <w:r>
+        <w:t xml:space="preserve">    "prcp",                    # precip mm</w:t>
+      </w:r>
+    </w:p>
+    <w:p>
+      <w:r>
+        <w:t xml:space="preserve">    "snow",                    # snow mm</w:t>
+      </w:r>
+    </w:p>
+    <w:p>
+      <w:r>
+        <w:t xml:space="preserve">    "tsun",                    # sunshine minutes</w:t>
+      </w:r>
+    </w:p>
+    <w:p>
+      <w:r>
+        <w:t>]].copy()</w:t>
+      </w:r>
+    </w:p>
+    <w:p/>
+    <w:p>
+      <w:r>
+        <w:t>print(summary.head(10))</w:t>
+      </w:r>
+    </w:p>
+    <w:p>
+      <w:r>
+        <w:t>summary.to_csv("palo_alto_3mo_daily.csv")</w:t>
+      </w:r>
+    </w:p>
+    <w:p/>
+    <w:p>
+      <w:r>
+        <w:t>Option C — Open-Meteo (free, no key, 90-day history built-in)</w:t>
+      </w:r>
+    </w:p>
+    <w:p>
+      <w:r>
+        <w:t>pip install openmeteo-requests requests-cache retry-requests pandas</w:t>
+      </w:r>
+    </w:p>
+    <w:p>
+      <w:r>
+        <w:t>import openmeteo_requests, pandas as pd</w:t>
+      </w:r>
+    </w:p>
+    <w:p>
+      <w:r>
+        <w:t>import requests_cache</w:t>
+      </w:r>
+    </w:p>
+    <w:p>
+      <w:r>
+        <w:t>from retry_requests import retry</w:t>
+      </w:r>
+    </w:p>
+    <w:p/>
+    <w:p>
+      <w:r>
+        <w:t>cache    = requests_cache.CachedSession(".cache", expire_after=3600)</w:t>
+      </w:r>
+    </w:p>
+    <w:p>
+      <w:r>
+        <w:t>session  = retry(cache, retries=5, backoff_factor=0.2)</w:t>
+      </w:r>
+    </w:p>
+    <w:p>
+      <w:r>
+        <w:t>om       = openmeteo_requests.Client(session=session)</w:t>
+      </w:r>
+    </w:p>
+    <w:p/>
+    <w:p>
+      <w:r>
+        <w:t>params = {</w:t>
+      </w:r>
+    </w:p>
+    <w:p>
+      <w:r>
+        <w:t xml:space="preserve">    "latitude":        37.4419,</w:t>
+      </w:r>
+    </w:p>
+    <w:p>
+      <w:r>
+        <w:lastRenderedPageBreak/>
+        <w:t xml:space="preserve">    "longitude":       -122.1430,</w:t>
+      </w:r>
+    </w:p>
+    <w:p>
+      <w:r>
+        <w:t xml:space="preserve">    "start_date":      "2024-12-01",</w:t>
+      </w:r>
+    </w:p>
+    <w:p>
+      <w:r>
+        <w:t xml:space="preserve">    "end_date":        "2025-03-01",</w:t>
+      </w:r>
+    </w:p>
+    <w:p>
+      <w:r>
+        <w:t xml:space="preserve">    "hourly": [</w:t>
+      </w:r>
+    </w:p>
+    <w:p>
+      <w:r>
+        <w:t xml:space="preserve">        "temperature_2m",</w:t>
+      </w:r>
+    </w:p>
+    <w:p>
+      <w:r>
+        <w:t xml:space="preserve">        "precipitation",</w:t>
+      </w:r>
+    </w:p>
+    <w:p>
+      <w:r>
+        <w:t xml:space="preserve">        "rain",</w:t>
+      </w:r>
+    </w:p>
+    <w:p>
+      <w:r>
+        <w:t xml:space="preserve">        "snowfall",</w:t>
+      </w:r>
+    </w:p>
+    <w:p>
+      <w:r>
+        <w:t xml:space="preserve">        "cloud_cover",</w:t>
+      </w:r>
+    </w:p>
+    <w:p>
+      <w:r>
+        <w:t xml:space="preserve">        "weather_code",      # WMO code → condition</w:t>
+      </w:r>
+    </w:p>
+    <w:p>
+      <w:r>
+        <w:t xml:space="preserve">    ],</w:t>
+      </w:r>
+    </w:p>
+    <w:p>
+      <w:r>
+        <w:t xml:space="preserve">    "daily": [</w:t>
+      </w:r>
+    </w:p>
+    <w:p>
+      <w:r>
+        <w:t xml:space="preserve">        "temperature_2m_max",</w:t>
+      </w:r>
+    </w:p>
+    <w:p>
+      <w:r>
+        <w:t xml:space="preserve">        "temperature_2m_min",</w:t>
+      </w:r>
+    </w:p>
+    <w:p>
+      <w:r>
+        <w:t xml:space="preserve">        "precipitation_sum",</w:t>
+      </w:r>
+    </w:p>
+    <w:p>
+      <w:r>
+        <w:t xml:space="preserve">        "rain_sum",</w:t>
+      </w:r>
+    </w:p>
+    <w:p>
+      <w:r>
+        <w:t xml:space="preserve">        "snowfall_sum",</w:t>
+      </w:r>
+    </w:p>
+    <w:p>
+      <w:r>
+        <w:t xml:space="preserve">        "precipitation_hours",</w:t>
+      </w:r>
+    </w:p>
+    <w:p>
+      <w:r>
+        <w:t xml:space="preserve">    ],</w:t>
+      </w:r>
+    </w:p>
+    <w:p>
+      <w:r>
+        <w:t xml:space="preserve">    "timezone": "America/Los_Angeles",</w:t>
+      </w:r>
+    </w:p>
+    <w:p>
+      <w:r>
+        <w:t>}</w:t>
+      </w:r>
+    </w:p>
+    <w:p/>
+    <w:p>
+      <w:r>
+        <w:t>resp   = om.weather_api("https://archive-api.open-meteo.com/v1/archive", params=params)[0]</w:t>
+      </w:r>
+    </w:p>
+    <w:p>
+      <w:r>
+        <w:t>hourly = resp.Hourly()</w:t>
+      </w:r>
+    </w:p>
+    <w:p/>
+    <w:p>
+      <w:r>
+        <w:lastRenderedPageBreak/>
+        <w:t># build hourly dataframe</w:t>
+      </w:r>
+    </w:p>
+    <w:p>
+      <w:r>
+        <w:t>import numpy as np</w:t>
+      </w:r>
+    </w:p>
+    <w:p>
+      <w:r>
+        <w:t>from datetime import timezone</w:t>
+      </w:r>
+    </w:p>
+    <w:p/>
+    <w:p>
+      <w:r>
+        <w:t>times = pd.date_range(</w:t>
+      </w:r>
+    </w:p>
+    <w:p>
+      <w:r>
+        <w:t xml:space="preserve">    start = pd.Timestamp(hourly.Time(), unit="s", tz="America/Los_Angeles"),</w:t>
+      </w:r>
+    </w:p>
+    <w:p>
+      <w:r>
+        <w:t xml:space="preserve">    end   = pd.Timestamp(hourly.TimeEnd(), unit="s", tz="America/Los_Angeles"),</w:t>
+      </w:r>
+    </w:p>
+    <w:p>
+      <w:r>
+        <w:t xml:space="preserve">    freq  = pd.Timedelta(seconds=hourly.Interval()),</w:t>
+      </w:r>
+    </w:p>
+    <w:p>
+      <w:r>
+        <w:t xml:space="preserve">    inclusive="left",</w:t>
+      </w:r>
+    </w:p>
+    <w:p>
+      <w:r>
+        <w:t>)</w:t>
+      </w:r>
+    </w:p>
+    <w:p/>
+    <w:p>
+      <w:r>
+        <w:t>df_hourly = pd.DataFrame({</w:t>
+      </w:r>
+    </w:p>
+    <w:p>
+      <w:r>
+        <w:t xml:space="preserve">    "datetime":       times,</w:t>
+      </w:r>
+    </w:p>
+    <w:p>
+      <w:r>
+        <w:t xml:space="preserve">    "temp_c":         hourly.Variables(0).ValuesAsNumpy(),</w:t>
+      </w:r>
+    </w:p>
+    <w:p>
+      <w:r>
+        <w:t xml:space="preserve">    "precipitation":  hourly.Variables(1).ValuesAsNumpy(),</w:t>
+      </w:r>
+    </w:p>
+    <w:p>
+      <w:r>
+        <w:t xml:space="preserve">    "rain_mm":        hourly.Variables(2).ValuesAsNumpy(),</w:t>
+      </w:r>
+    </w:p>
+    <w:p>
+      <w:r>
+        <w:t xml:space="preserve">    "snowfall_cm":    hourly.Variables(3).ValuesAsNumpy(),</w:t>
+      </w:r>
+    </w:p>
+    <w:p>
+      <w:r>
+        <w:t xml:space="preserve">    "cloud_cover_pct":hourly.Variables(4).ValuesAsNumpy(),</w:t>
+      </w:r>
+    </w:p>
+    <w:p>
+      <w:r>
+        <w:t xml:space="preserve">    "weather_code":   hourly.Variables(5).ValuesAsNumpy(),</w:t>
+      </w:r>
+    </w:p>
+    <w:p>
+      <w:r>
+        <w:t>}).set_index("datetime")</w:t>
+      </w:r>
+    </w:p>
+    <w:p/>
+    <w:p>
+      <w:r>
+        <w:t>print(df_hourly.head(10))</w:t>
+      </w:r>
+    </w:p>
+    <w:p>
+      <w:r>
+        <w:t>df_hourly.to_csv("palo_alto_3mo_open_meteo.csv")</w:t>
+      </w:r>
+    </w:p>
+    <w:p/>
+    <w:p>
+      <w:pPr>
+        <w:spacing w:before="100" w:beforeAutospacing="1" w:after="100" w:afterAutospacing="1" w:line="240" w:lineRule="auto"/>
+        <w:outlineLvl w:val="1"/>
+        <w:rPr>
+          <w:rFonts w:ascii="Times New Roman" w:eastAsia="Times New Roman" w:hAnsi="Times New Roman" w:cs="Times New Roman"/>
+          <w:b/>
+          <w:bCs/>
+          <w:kern w:val="0"/>
+          <w:sz w:val="36"/>
+          <w:szCs w:val="36"/>
+          <w14:ligatures w14:val="none"/>
+        </w:rPr>
+      </w:pPr>
+      <w:r>
+        <w:rPr>
+          <w:rFonts w:ascii="Times New Roman" w:eastAsia="Times New Roman" w:hAnsi="Times New Roman" w:cs="Times New Roman"/>
+          <w:b/>
+          <w:bCs/>
+          <w:kern w:val="0"/>
+          <w:sz w:val="36"/>
+          <w:szCs w:val="36"/>
+          <w14:ligatures w14:val="none"/>
+        </w:rPr>
+        <w:t>Which Option to Use?</w:t>
+      </w:r>
+    </w:p>
+    <w:tbl>
+      <w:tblPr>
+        <w:tblW w:w="0" w:type="auto"/>
+        <w:tblCellSpacing w:w="15" w:type="dxa"/>
+        <w:tblCellMar>
+          <w:top w:w="15" w:type="dxa"/>
+          <w:left w:w="15" w:type="dxa"/>
+          <w:bottom w:w="15" w:type="dxa"/>
+          <w:right w:w="15" w:type="dxa"/>
+        </w:tblCellMar>
+        <w:tblLook w:val="04A0" w:firstRow="1" w:lastRow="0" w:firstColumn="1" w:lastColumn="0" w:noHBand="0" w:noVBand="1"/>
+      </w:tblPr>
+      <w:tblGrid>
+        <w:gridCol w:w="1715"/>
+        <w:gridCol w:w="2586"/>
+        <w:gridCol w:w="2367"/>
+        <w:gridCol w:w="2308"/>
+      </w:tblGrid>
+      <w:tr>
+        <w:trPr>
+          <w:tblHeader/>
+          <w:tblCellSpacing w:w="15" w:type="dxa"/>
+        </w:trPr>
+        <w:tc>
+          <w:tcPr>
+            <w:tcW w:w="0" w:type="auto"/>
+            <w:vAlign w:val="center"/>
+            <w:hideMark/>
+          </w:tcPr>
+          <w:p>
+            <w:pPr>
+              <w:spacing w:after="0" w:line="240" w:lineRule="auto"/>
+              <w:rPr>
+                <w:rFonts w:ascii="Times New Roman" w:eastAsia="Times New Roman" w:hAnsi="Times New Roman" w:cs="Times New Roman"/>
+                <w:kern w:val="0"/>
+                <w14:ligatures w14:val="none"/>
+              </w:rPr>
+            </w:pPr>
+          </w:p>
+        </w:tc>
+        <w:tc>
+          <w:tcPr>
+            <w:tcW w:w="0" w:type="auto"/>
+            <w:vAlign w:val="center"/>
+            <w:hideMark/>
+          </w:tcPr>
+          <w:p>
+            <w:pPr>
+              <w:spacing w:after="0" w:line="240" w:lineRule="auto"/>
+              <w:jc w:val="center"/>
+              <w:rPr>
+                <w:rFonts w:ascii="Times New Roman" w:eastAsia="Times New Roman" w:hAnsi="Times New Roman" w:cs="Times New Roman"/>
+                <w:b/>
+                <w:bCs/>
+                <w:kern w:val="0"/>
+                <w14:ligatures w14:val="none"/>
+              </w:rPr>
+            </w:pPr>
+            <w:r>
+              <w:rPr>
+                <w:rFonts w:ascii="Times New Roman" w:eastAsia="Times New Roman" w:hAnsi="Times New Roman" w:cs="Times New Roman"/>
+                <w:b/>
+                <w:bCs/>
+                <w:kern w:val="0"/>
+                <w14:ligatures w14:val="none"/>
+              </w:rPr>
+              <w:t>OWM Timemachine</w:t>
+            </w:r>
+          </w:p>
+        </w:tc>
+        <w:tc>
+          <w:tcPr>
+            <w:tcW w:w="0" w:type="auto"/>
+            <w:vAlign w:val="center"/>
+            <w:hideMark/>
+          </w:tcPr>
+          <w:p>
+            <w:pPr>
+              <w:spacing w:after="0" w:line="240" w:lineRule="auto"/>
+              <w:jc w:val="center"/>
+              <w:rPr>
+                <w:rFonts w:ascii="Times New Roman" w:eastAsia="Times New Roman" w:hAnsi="Times New Roman" w:cs="Times New Roman"/>
+                <w:b/>
+                <w:bCs/>
+                <w:kern w:val="0"/>
+                <w14:ligatures w14:val="none"/>
+              </w:rPr>
+            </w:pPr>
+            <w:r>
+              <w:rPr>
+                <w:rFonts w:ascii="Times New Roman" w:eastAsia="Times New Roman" w:hAnsi="Times New Roman" w:cs="Times New Roman"/>
+                <w:b/>
+                <w:bCs/>
+                <w:kern w:val="0"/>
+                <w14:ligatures w14:val="none"/>
+              </w:rPr>
+              <w:t>Meteostat</w:t>
+            </w:r>
+          </w:p>
+        </w:tc>
+        <w:tc>
+          <w:tcPr>
+            <w:tcW w:w="0" w:type="auto"/>
+            <w:vAlign w:val="center"/>
+            <w:hideMark/>
+          </w:tcPr>
+          <w:p>
+            <w:pPr>
+              <w:spacing w:after="0" w:line="240" w:lineRule="auto"/>
+              <w:jc w:val="center"/>
+              <w:rPr>
+                <w:rFonts w:ascii="Times New Roman" w:eastAsia="Times New Roman" w:hAnsi="Times New Roman" w:cs="Times New Roman"/>
+                <w:b/>
+                <w:bCs/>
+                <w:kern w:val="0"/>
+                <w14:ligatures w14:val="none"/>
+              </w:rPr>
+            </w:pPr>
+            <w:r>
+              <w:rPr>
+                <w:rFonts w:ascii="Times New Roman" w:eastAsia="Times New Roman" w:hAnsi="Times New Roman" w:cs="Times New Roman"/>
+                <w:b/>
+                <w:bCs/>
+                <w:kern w:val="0"/>
+                <w14:ligatures w14:val="none"/>
+              </w:rPr>
+              <w:t>Open-Meteo</w:t>
+            </w:r>
+          </w:p>
+        </w:tc>
+      </w:tr>
+      <w:tr>
+        <w:trPr>
+          <w:tblCellSpacing w:w="15" w:type="dxa"/>
+        </w:trPr>
+        <w:tc>
+          <w:tcPr>
+            <w:tcW w:w="0" w:type="auto"/>
+            <w:vAlign w:val="center"/>
+            <w:hideMark/>
+          </w:tcPr>
+          <w:p>
+            <w:pPr>
+              <w:spacing w:after="0" w:line="240" w:lineRule="auto"/>
+              <w:rPr>
+                <w:rFonts w:ascii="Times New Roman" w:eastAsia="Times New Roman" w:hAnsi="Times New Roman" w:cs="Times New Roman"/>
+                <w:kern w:val="0"/>
+                <w14:ligatures w14:val="none"/>
+              </w:rPr>
+            </w:pPr>
+            <w:r>
+              <w:rPr>
+                <w:rFonts w:ascii="Times New Roman" w:eastAsia="Times New Roman" w:hAnsi="Times New Roman" w:cs="Times New Roman"/>
+                <w:kern w:val="0"/>
+                <w14:ligatures w14:val="none"/>
+              </w:rPr>
+              <w:t>Free?</w:t>
+            </w:r>
+          </w:p>
+        </w:tc>
+        <w:tc>
+          <w:tcPr>
+            <w:tcW w:w="0" w:type="auto"/>
+            <w:vAlign w:val="center"/>
+            <w:hideMark/>
+          </w:tcPr>
+          <w:p>
+            <w:pPr>
+              <w:spacing w:after="0" w:line="240" w:lineRule="auto"/>
+              <w:rPr>
+                <w:rFonts w:ascii="Times New Roman" w:eastAsia="Times New Roman" w:hAnsi="Times New Roman" w:cs="Times New Roman"/>
+                <w:kern w:val="0"/>
+                <w14:ligatures w14:val="none"/>
+              </w:rPr>
+            </w:pPr>
+            <w:r>
+              <w:rPr>
+                <w:rFonts w:ascii="Times New Roman" w:eastAsia="Times New Roman" w:hAnsi="Times New Roman" w:cs="Times New Roman"/>
+                <w:kern w:val="0"/>
+                <w14:ligatures w14:val="none"/>
+              </w:rPr>
+              <w:t>1k calls/day free, then pay</w:t>
+            </w:r>
+          </w:p>
+        </w:tc>
+        <w:tc>
+          <w:tcPr>
+            <w:tcW w:w="0" w:type="auto"/>
+            <w:vAlign w:val="center"/>
+            <w:hideMark/>
+          </w:tcPr>
+          <w:p>
+            <w:pPr>
+              <w:spacing w:after="0" w:line="240" w:lineRule="auto"/>
+              <w:rPr>
+                <w:rFonts w:ascii="Times New Roman" w:eastAsia="Times New Roman" w:hAnsi="Times New Roman" w:cs="Times New Roman"/>
+                <w:kern w:val="0"/>
+                <w14:ligatures w14:val="none"/>
+              </w:rPr>
+            </w:pPr>
+            <w:r>
+              <w:rPr>
+                <w:rFonts w:ascii="Apple Color Emoji" w:eastAsia="Times New Roman" w:hAnsi="Apple Color Emoji" w:cs="Apple Color Emoji"/>
+                <w:kern w:val="0"/>
+                <w14:ligatures w14:val="none"/>
+              </w:rPr>
+              <w:t>✅</w:t>
+            </w:r>
+            <w:r>
+              <w:rPr>
+                <w:rFonts w:ascii="Times New Roman" w:eastAsia="Times New Roman" w:hAnsi="Times New Roman" w:cs="Times New Roman"/>
+                <w:kern w:val="0"/>
+                <w14:ligatures w14:val="none"/>
+              </w:rPr>
+              <w:t xml:space="preserve"> fully free</w:t>
+            </w:r>
+          </w:p>
+        </w:tc>
+        <w:tc>
+          <w:tcPr>
+            <w:tcW w:w="0" w:type="auto"/>
+            <w:vAlign w:val="center"/>
+            <w:hideMark/>
+          </w:tcPr>
+          <w:p>
+            <w:pPr>
+              <w:spacing w:after="0" w:line="240" w:lineRule="auto"/>
+              <w:rPr>
+                <w:rFonts w:ascii="Times New Roman" w:eastAsia="Times New Roman" w:hAnsi="Times New Roman" w:cs="Times New Roman"/>
+                <w:kern w:val="0"/>
+                <w14:ligatures w14:val="none"/>
+              </w:rPr>
+            </w:pPr>
+            <w:r>
+              <w:rPr>
+                <w:rFonts w:ascii="Apple Color Emoji" w:eastAsia="Times New Roman" w:hAnsi="Apple Color Emoji" w:cs="Apple Color Emoji"/>
+                <w:kern w:val="0"/>
+                <w14:ligatures w14:val="none"/>
+              </w:rPr>
+              <w:t>✅</w:t>
+            </w:r>
+            <w:r>
+              <w:rPr>
+                <w:rFonts w:ascii="Times New Roman" w:eastAsia="Times New Roman" w:hAnsi="Times New Roman" w:cs="Times New Roman"/>
+                <w:kern w:val="0"/>
+                <w14:ligatures w14:val="none"/>
+              </w:rPr>
+              <w:t xml:space="preserve"> fully free</w:t>
+            </w:r>
+          </w:p>
+        </w:tc>
+      </w:tr>
+      <w:tr>
+        <w:trPr>
+          <w:tblCellSpacing w:w="15" w:type="dxa"/>
+        </w:trPr>
+        <w:tc>
+          <w:tcPr>
+            <w:tcW w:w="0" w:type="auto"/>
+            <w:vAlign w:val="center"/>
+            <w:hideMark/>
+          </w:tcPr>
+          <w:p>
+            <w:pPr>
+              <w:spacing w:after="0" w:line="240" w:lineRule="auto"/>
+              <w:rPr>
+                <w:rFonts w:ascii="Times New Roman" w:eastAsia="Times New Roman" w:hAnsi="Times New Roman" w:cs="Times New Roman"/>
+                <w:kern w:val="0"/>
+                <w14:ligatures w14:val="none"/>
+              </w:rPr>
+            </w:pPr>
+            <w:r>
+              <w:rPr>
+                <w:rFonts w:ascii="Times New Roman" w:eastAsia="Times New Roman" w:hAnsi="Times New Roman" w:cs="Times New Roman"/>
+                <w:kern w:val="0"/>
+                <w14:ligatures w14:val="none"/>
+              </w:rPr>
+              <w:t>API key needed?</w:t>
+            </w:r>
+          </w:p>
+        </w:tc>
+        <w:tc>
+          <w:tcPr>
+            <w:tcW w:w="0" w:type="auto"/>
+            <w:vAlign w:val="center"/>
+            <w:hideMark/>
+          </w:tcPr>
+          <w:p>
+            <w:pPr>
+              <w:spacing w:after="0" w:line="240" w:lineRule="auto"/>
+              <w:rPr>
+                <w:rFonts w:ascii="Times New Roman" w:eastAsia="Times New Roman" w:hAnsi="Times New Roman" w:cs="Times New Roman"/>
+                <w:kern w:val="0"/>
+                <w14:ligatures w14:val="none"/>
+              </w:rPr>
+            </w:pPr>
+            <w:r>
+              <w:rPr>
+                <w:rFonts w:ascii="Times New Roman" w:eastAsia="Times New Roman" w:hAnsi="Times New Roman" w:cs="Times New Roman"/>
+                <w:kern w:val="0"/>
+                <w14:ligatures w14:val="none"/>
+              </w:rPr>
+              <w:t>Yes</w:t>
+            </w:r>
+          </w:p>
+        </w:tc>
+        <w:tc>
+          <w:tcPr>
+            <w:tcW w:w="0" w:type="auto"/>
+            <w:vAlign w:val="center"/>
+            <w:hideMark/>
+          </w:tcPr>
+          <w:p>
+            <w:pPr>
+              <w:spacing w:after="0" w:line="240" w:lineRule="auto"/>
+              <w:rPr>
+                <w:rFonts w:ascii="Times New Roman" w:eastAsia="Times New Roman" w:hAnsi="Times New Roman" w:cs="Times New Roman"/>
+                <w:kern w:val="0"/>
+                <w14:ligatures w14:val="none"/>
+              </w:rPr>
+            </w:pPr>
+            <w:r>
+              <w:rPr>
+                <w:rFonts w:ascii="Times New Roman" w:eastAsia="Times New Roman" w:hAnsi="Times New Roman" w:cs="Times New Roman"/>
+                <w:kern w:val="0"/>
+                <w14:ligatures w14:val="none"/>
+              </w:rPr>
+              <w:t>No</w:t>
+            </w:r>
+          </w:p>
+        </w:tc>
+        <w:tc>
+          <w:tcPr>
+            <w:tcW w:w="0" w:type="auto"/>
+            <w:vAlign w:val="center"/>
+            <w:hideMark/>
+          </w:tcPr>
+          <w:p>
+            <w:pPr>
+              <w:spacing w:after="0" w:line="240" w:lineRule="auto"/>
+              <w:rPr>
+                <w:rFonts w:ascii="Times New Roman" w:eastAsia="Times New Roman" w:hAnsi="Times New Roman" w:cs="Times New Roman"/>
+                <w:kern w:val="0"/>
+                <w14:ligatures w14:val="none"/>
+              </w:rPr>
+            </w:pPr>
+            <w:r>
+              <w:rPr>
+                <w:rFonts w:ascii="Times New Roman" w:eastAsia="Times New Roman" w:hAnsi="Times New Roman" w:cs="Times New Roman"/>
+                <w:kern w:val="0"/>
+                <w14:ligatures w14:val="none"/>
+              </w:rPr>
+              <w:t>No</w:t>
+            </w:r>
+          </w:p>
+        </w:tc>
+      </w:tr>
+      <w:tr>
+        <w:trPr>
+          <w:tblCellSpacing w:w="15" w:type="dxa"/>
+        </w:trPr>
+        <w:tc>
+          <w:tcPr>
+            <w:tcW w:w="0" w:type="auto"/>
+            <w:vAlign w:val="center"/>
+            <w:hideMark/>
+          </w:tcPr>
+          <w:p>
+            <w:pPr>
+              <w:spacing w:after="0" w:line="240" w:lineRule="auto"/>
+              <w:rPr>
+                <w:rFonts w:ascii="Times New Roman" w:eastAsia="Times New Roman" w:hAnsi="Times New Roman" w:cs="Times New Roman"/>
+                <w:kern w:val="0"/>
+                <w14:ligatures w14:val="none"/>
+              </w:rPr>
+            </w:pPr>
+            <w:r>
+              <w:rPr>
+                <w:rFonts w:ascii="Times New Roman" w:eastAsia="Times New Roman" w:hAnsi="Times New Roman" w:cs="Times New Roman"/>
+                <w:kern w:val="0"/>
+                <w14:ligatures w14:val="none"/>
+              </w:rPr>
+              <w:t>90-day history</w:t>
+            </w:r>
+          </w:p>
+        </w:tc>
+        <w:tc>
+          <w:tcPr>
+            <w:tcW w:w="0" w:type="auto"/>
+            <w:vAlign w:val="center"/>
+            <w:hideMark/>
+          </w:tcPr>
+          <w:p>
+            <w:pPr>
+              <w:spacing w:after="0" w:line="240" w:lineRule="auto"/>
+              <w:rPr>
+                <w:rFonts w:ascii="Times New Roman" w:eastAsia="Times New Roman" w:hAnsi="Times New Roman" w:cs="Times New Roman"/>
+                <w:kern w:val="0"/>
+                <w14:ligatures w14:val="none"/>
+              </w:rPr>
+            </w:pPr>
+            <w:r>
+              <w:rPr>
+                <w:rFonts w:ascii="Times New Roman" w:eastAsia="Times New Roman" w:hAnsi="Times New Roman" w:cs="Times New Roman"/>
+                <w:kern w:val="0"/>
+                <w14:ligatures w14:val="none"/>
+              </w:rPr>
+              <w:t>Yes</w:t>
+            </w:r>
+          </w:p>
+        </w:tc>
+        <w:tc>
+          <w:tcPr>
+            <w:tcW w:w="0" w:type="auto"/>
+            <w:vAlign w:val="center"/>
+            <w:hideMark/>
+          </w:tcPr>
+          <w:p>
+            <w:pPr>
+              <w:spacing w:after="0" w:line="240" w:lineRule="auto"/>
+              <w:rPr>
+                <w:rFonts w:ascii="Times New Roman" w:eastAsia="Times New Roman" w:hAnsi="Times New Roman" w:cs="Times New Roman"/>
+                <w:kern w:val="0"/>
+                <w14:ligatures w14:val="none"/>
+              </w:rPr>
+            </w:pPr>
+            <w:r>
+              <w:rPr>
+                <w:rFonts w:ascii="Times New Roman" w:eastAsia="Times New Roman" w:hAnsi="Times New Roman" w:cs="Times New Roman"/>
+                <w:kern w:val="0"/>
+                <w14:ligatures w14:val="none"/>
+              </w:rPr>
+              <w:t>Yes</w:t>
+            </w:r>
+          </w:p>
+        </w:tc>
+        <w:tc>
+          <w:tcPr>
+            <w:tcW w:w="0" w:type="auto"/>
+            <w:vAlign w:val="center"/>
+            <w:hideMark/>
+          </w:tcPr>
+          <w:p>
+            <w:pPr>
+              <w:spacing w:after="0" w:line="240" w:lineRule="auto"/>
+              <w:rPr>
+                <w:rFonts w:ascii="Times New Roman" w:eastAsia="Times New Roman" w:hAnsi="Times New Roman" w:cs="Times New Roman"/>
+                <w:kern w:val="0"/>
+                <w14:ligatures w14:val="none"/>
+              </w:rPr>
+            </w:pPr>
+            <w:r>
+              <w:rPr>
+                <w:rFonts w:ascii="Times New Roman" w:eastAsia="Times New Roman" w:hAnsi="Times New Roman" w:cs="Times New Roman"/>
+                <w:kern w:val="0"/>
+                <w14:ligatures w14:val="none"/>
+              </w:rPr>
+              <w:t>Yes</w:t>
+            </w:r>
+          </w:p>
+        </w:tc>
+      </w:tr>
+      <w:tr>
+        <w:trPr>
+          <w:tblCellSpacing w:w="15" w:type="dxa"/>
+        </w:trPr>
+        <w:tc>
+          <w:tcPr>
+            <w:tcW w:w="0" w:type="auto"/>
+            <w:vAlign w:val="center"/>
+            <w:hideMark/>
+          </w:tcPr>
+          <w:p>
+            <w:pPr>
+              <w:spacing w:after="0" w:line="240" w:lineRule="auto"/>
+              <w:rPr>
+                <w:rFonts w:ascii="Times New Roman" w:eastAsia="Times New Roman" w:hAnsi="Times New Roman" w:cs="Times New Roman"/>
+                <w:kern w:val="0"/>
+                <w14:ligatures w14:val="none"/>
+              </w:rPr>
+            </w:pPr>
+            <w:r>
+              <w:rPr>
+                <w:rFonts w:ascii="Times New Roman" w:eastAsia="Times New Roman" w:hAnsi="Times New Roman" w:cs="Times New Roman"/>
+                <w:kern w:val="0"/>
+                <w14:ligatures w14:val="none"/>
+              </w:rPr>
+              <w:t>Hourly data</w:t>
+            </w:r>
+          </w:p>
+        </w:tc>
+        <w:tc>
+          <w:tcPr>
+            <w:tcW w:w="0" w:type="auto"/>
+            <w:vAlign w:val="center"/>
+            <w:hideMark/>
+          </w:tcPr>
+          <w:p>
+            <w:pPr>
+              <w:spacing w:after="0" w:line="240" w:lineRule="auto"/>
+              <w:rPr>
+                <w:rFonts w:ascii="Times New Roman" w:eastAsia="Times New Roman" w:hAnsi="Times New Roman" w:cs="Times New Roman"/>
+                <w:kern w:val="0"/>
+                <w14:ligatures w14:val="none"/>
+              </w:rPr>
+            </w:pPr>
+            <w:r>
+              <w:rPr>
+                <w:rFonts w:ascii="Times New Roman" w:eastAsia="Times New Roman" w:hAnsi="Times New Roman" w:cs="Times New Roman"/>
+                <w:kern w:val="0"/>
+                <w14:ligatures w14:val="none"/>
+              </w:rPr>
+              <w:t>Yes</w:t>
+            </w:r>
+          </w:p>
+        </w:tc>
+        <w:tc>
+          <w:tcPr>
+            <w:tcW w:w="0" w:type="auto"/>
+            <w:vAlign w:val="center"/>
+            <w:hideMark/>
+          </w:tcPr>
+          <w:p>
+            <w:pPr>
+              <w:spacing w:after="0" w:line="240" w:lineRule="auto"/>
+              <w:rPr>
+                <w:rFonts w:ascii="Times New Roman" w:eastAsia="Times New Roman" w:hAnsi="Times New Roman" w:cs="Times New Roman"/>
+                <w:kern w:val="0"/>
+                <w14:ligatures w14:val="none"/>
+              </w:rPr>
+            </w:pPr>
+            <w:r>
+              <w:rPr>
+                <w:rFonts w:ascii="Times New Roman" w:eastAsia="Times New Roman" w:hAnsi="Times New Roman" w:cs="Times New Roman"/>
+                <w:kern w:val="0"/>
+                <w14:ligatures w14:val="none"/>
+              </w:rPr>
+              <w:t>Yes</w:t>
+            </w:r>
+          </w:p>
+        </w:tc>
+        <w:tc>
+          <w:tcPr>
+            <w:tcW w:w="0" w:type="auto"/>
+            <w:vAlign w:val="center"/>
+            <w:hideMark/>
+          </w:tcPr>
+          <w:p>
+            <w:pPr>
+              <w:spacing w:after="0" w:line="240" w:lineRule="auto"/>
+              <w:rPr>
+                <w:rFonts w:ascii="Times New Roman" w:eastAsia="Times New Roman" w:hAnsi="Times New Roman" w:cs="Times New Roman"/>
+                <w:kern w:val="0"/>
+                <w14:ligatures w14:val="none"/>
+              </w:rPr>
+            </w:pPr>
+            <w:r>
+              <w:rPr>
+                <w:rFonts w:ascii="Times New Roman" w:eastAsia="Times New Roman" w:hAnsi="Times New Roman" w:cs="Times New Roman"/>
+                <w:kern w:val="0"/>
+                <w14:ligatures w14:val="none"/>
+              </w:rPr>
+              <w:t>Yes</w:t>
+            </w:r>
+          </w:p>
+        </w:tc>
+      </w:tr>
+      <w:tr>
+        <w:trPr>
+          <w:tblCellSpacing w:w="15" w:type="dxa"/>
+        </w:trPr>
+        <w:tc>
+          <w:tcPr>
+            <w:tcW w:w="0" w:type="auto"/>
+            <w:vAlign w:val="center"/>
+            <w:hideMark/>
+          </w:tcPr>
+          <w:p>
+            <w:pPr>
+              <w:spacing w:after="0" w:line="240" w:lineRule="auto"/>
+              <w:rPr>
+                <w:rFonts w:ascii="Times New Roman" w:eastAsia="Times New Roman" w:hAnsi="Times New Roman" w:cs="Times New Roman"/>
+                <w:kern w:val="0"/>
+                <w14:ligatures w14:val="none"/>
+              </w:rPr>
+            </w:pPr>
+            <w:r>
+              <w:rPr>
+                <w:rFonts w:ascii="Times New Roman" w:eastAsia="Times New Roman" w:hAnsi="Times New Roman" w:cs="Times New Roman"/>
+                <w:kern w:val="0"/>
+                <w14:ligatures w14:val="none"/>
+              </w:rPr>
+              <w:t>Ease of use</w:t>
+            </w:r>
+          </w:p>
+        </w:tc>
+        <w:tc>
+          <w:tcPr>
+            <w:tcW w:w="0" w:type="auto"/>
+            <w:vAlign w:val="center"/>
+            <w:hideMark/>
+          </w:tcPr>
+          <w:p>
+            <w:pPr>
+              <w:spacing w:after="0" w:line="240" w:lineRule="auto"/>
+              <w:rPr>
+                <w:rFonts w:ascii="Times New Roman" w:eastAsia="Times New Roman" w:hAnsi="Times New Roman" w:cs="Times New Roman"/>
+                <w:kern w:val="0"/>
+                <w14:ligatures w14:val="none"/>
+              </w:rPr>
+            </w:pPr>
+            <w:r>
+              <w:rPr>
+                <w:rFonts w:ascii="Times New Roman" w:eastAsia="Times New Roman" w:hAnsi="Times New Roman" w:cs="Times New Roman"/>
+                <w:kern w:val="0"/>
+                <w14:ligatures w14:val="none"/>
+              </w:rPr>
+              <w:t>Medium</w:t>
+            </w:r>
+          </w:p>
+        </w:tc>
+        <w:tc>
+          <w:tcPr>
+            <w:tcW w:w="0" w:type="auto"/>
+            <w:vAlign w:val="center"/>
+            <w:hideMark/>
+          </w:tcPr>
+          <w:p>
+            <w:pPr>
+              <w:spacing w:after="0" w:line="240" w:lineRule="auto"/>
+              <w:rPr>
+                <w:rFonts w:ascii="Times New Roman" w:eastAsia="Times New Roman" w:hAnsi="Times New Roman" w:cs="Times New Roman"/>
+                <w:kern w:val="0"/>
+                <w14:ligatures w14:val="none"/>
+              </w:rPr>
+            </w:pPr>
+            <w:r>
+              <w:rPr>
+                <w:rFonts w:ascii="Times New Roman" w:eastAsia="Times New Roman" w:hAnsi="Times New Roman" w:cs="Times New Roman"/>
+                <w:kern w:val="0"/>
+                <w14:ligatures w14:val="none"/>
+              </w:rPr>
+              <w:t>Easy</w:t>
+            </w:r>
+          </w:p>
+        </w:tc>
+        <w:tc>
+          <w:tcPr>
+            <w:tcW w:w="0" w:type="auto"/>
+            <w:vAlign w:val="center"/>
+            <w:hideMark/>
+          </w:tcPr>
+          <w:p>
+            <w:pPr>
+              <w:spacing w:after="0" w:line="240" w:lineRule="auto"/>
+              <w:rPr>
+                <w:rFonts w:ascii="Times New Roman" w:eastAsia="Times New Roman" w:hAnsi="Times New Roman" w:cs="Times New Roman"/>
+                <w:kern w:val="0"/>
+                <w14:ligatures w14:val="none"/>
+              </w:rPr>
+            </w:pPr>
+            <w:r>
+              <w:rPr>
+                <w:rFonts w:ascii="Times New Roman" w:eastAsia="Times New Roman" w:hAnsi="Times New Roman" w:cs="Times New Roman"/>
+                <w:kern w:val="0"/>
+                <w14:ligatures w14:val="none"/>
+              </w:rPr>
+              <w:t>Easy</w:t>
+            </w:r>
+          </w:p>
+        </w:tc>
+      </w:tr>
+      <w:tr>
+        <w:trPr>
+          <w:tblCellSpacing w:w="15" w:type="dxa"/>
+        </w:trPr>
+        <w:tc>
+          <w:tcPr>
+            <w:tcW w:w="0" w:type="auto"/>
+            <w:vAlign w:val="center"/>
+            <w:hideMark/>
+          </w:tcPr>
+          <w:p>
+            <w:pPr>
+              <w:spacing w:after="0" w:line="240" w:lineRule="auto"/>
+              <w:rPr>
+                <w:rFonts w:ascii="Times New Roman" w:eastAsia="Times New Roman" w:hAnsi="Times New Roman" w:cs="Times New Roman"/>
+                <w:kern w:val="0"/>
+                <w14:ligatures w14:val="none"/>
+              </w:rPr>
+            </w:pPr>
+            <w:r>
+              <w:rPr>
+                <w:rFonts w:ascii="Times New Roman" w:eastAsia="Times New Roman" w:hAnsi="Times New Roman" w:cs="Times New Roman"/>
+                <w:kern w:val="0"/>
+                <w14:ligatures w14:val="none"/>
+              </w:rPr>
+              <w:t>Best for</w:t>
+            </w:r>
+          </w:p>
+        </w:tc>
+        <w:tc>
+          <w:tcPr>
+            <w:tcW w:w="0" w:type="auto"/>
+            <w:vAlign w:val="center"/>
+            <w:hideMark/>
+          </w:tcPr>
+          <w:p>
+            <w:pPr>
+              <w:spacing w:after="0" w:line="240" w:lineRule="auto"/>
+              <w:rPr>
+                <w:rFonts w:ascii="Times New Roman" w:eastAsia="Times New Roman" w:hAnsi="Times New Roman" w:cs="Times New Roman"/>
+                <w:kern w:val="0"/>
+                <w14:ligatures w14:val="none"/>
+              </w:rPr>
+            </w:pPr>
+            <w:r>
+              <w:rPr>
+                <w:rFonts w:ascii="Times New Roman" w:eastAsia="Times New Roman" w:hAnsi="Times New Roman" w:cs="Times New Roman"/>
+                <w:kern w:val="0"/>
+                <w14:ligatures w14:val="none"/>
+              </w:rPr>
+              <w:t>Already using OWM</w:t>
+            </w:r>
+          </w:p>
+        </w:tc>
+        <w:tc>
+          <w:tcPr>
+            <w:tcW w:w="0" w:type="auto"/>
+            <w:vAlign w:val="center"/>
+            <w:hideMark/>
+          </w:tcPr>
+          <w:p>
+            <w:pPr>
+              <w:spacing w:after="0" w:line="240" w:lineRule="auto"/>
+              <w:rPr>
+                <w:rFonts w:ascii="Times New Roman" w:eastAsia="Times New Roman" w:hAnsi="Times New Roman" w:cs="Times New Roman"/>
+                <w:kern w:val="0"/>
+                <w14:ligatures w14:val="none"/>
+              </w:rPr>
+            </w:pPr>
+            <w:r>
+              <w:rPr>
+                <w:rFonts w:ascii="Times New Roman" w:eastAsia="Times New Roman" w:hAnsi="Times New Roman" w:cs="Times New Roman"/>
+                <w:kern w:val="0"/>
+                <w14:ligatures w14:val="none"/>
+              </w:rPr>
+              <w:t>Quick pandas workflow</w:t>
+            </w:r>
+          </w:p>
+        </w:tc>
+        <w:tc>
+          <w:tcPr>
+            <w:tcW w:w="0" w:type="auto"/>
+            <w:vAlign w:val="center"/>
+            <w:hideMark/>
+          </w:tcPr>
+          <w:p>
+            <w:pPr>
+              <w:spacing w:after="0" w:line="240" w:lineRule="auto"/>
+              <w:rPr>
+                <w:rFonts w:ascii="Times New Roman" w:eastAsia="Times New Roman" w:hAnsi="Times New Roman" w:cs="Times New Roman"/>
+                <w:kern w:val="0"/>
+                <w14:ligatures w14:val="none"/>
+              </w:rPr>
+            </w:pPr>
+            <w:r>
+              <w:rPr>
+                <w:rFonts w:ascii="Times New Roman" w:eastAsia="Times New Roman" w:hAnsi="Times New Roman" w:cs="Times New Roman"/>
+                <w:kern w:val="0"/>
+                <w14:ligatures w14:val="none"/>
+              </w:rPr>
+              <w:t>Most flexible/complete</w:t>
+            </w:r>
+          </w:p>
+        </w:tc>
+      </w:tr>
+    </w:tbl>
+    <w:p>
+      <w:pPr>
+        <w:spacing w:before="100" w:beforeAutospacing="1" w:after="100" w:afterAutospacing="1" w:line="240" w:lineRule="auto"/>
+        <w:rPr>
+          <w:rFonts w:ascii="Times New Roman" w:eastAsia="Times New Roman" w:hAnsi="Times New Roman" w:cs="Times New Roman"/>
+          <w:kern w:val="0"/>
+          <w14:ligatures w14:val="none"/>
+        </w:rPr>
+      </w:pPr>
+      <w:r>
+        <w:rPr>
+          <w:rFonts w:ascii="Times New Roman" w:eastAsia="Times New Roman" w:hAnsi="Times New Roman" w:cs="Times New Roman"/>
+          <w:b/>
+          <w:bCs/>
+          <w:kern w:val="0"/>
+          <w14:ligatures w14:val="none"/>
+        </w:rPr>
+        <w:t>Recommendation:</w:t>
+      </w:r>
+      <w:r>
+        <w:rPr>
+          <w:rFonts w:ascii="Times New Roman" w:eastAsia="Times New Roman" w:hAnsi="Times New Roman" w:cs="Times New Roman"/>
+          <w:kern w:val="0"/>
+          <w14:ligatures w14:val="none"/>
+        </w:rPr>
+        <w:t xml:space="preserve"> Use </w:t>
+      </w:r>
+      <w:r>
+        <w:rPr>
+          <w:rFonts w:ascii="Times New Roman" w:eastAsia="Times New Roman" w:hAnsi="Times New Roman" w:cs="Times New Roman"/>
+          <w:b/>
+          <w:bCs/>
+          <w:kern w:val="0"/>
+          <w14:ligatures w14:val="none"/>
+        </w:rPr>
+        <w:t>Open-Meteo</w:t>
+      </w:r>
+      <w:r>
+        <w:rPr>
+          <w:rFonts w:ascii="Times New Roman" w:eastAsia="Times New Roman" w:hAnsi="Times New Roman" w:cs="Times New Roman"/>
+          <w:kern w:val="0"/>
+          <w14:ligatures w14:val="none"/>
+        </w:rPr>
+        <w:t xml:space="preserve"> — no key, 90 days, hourly resolution, clean pandas output in one call.</w:t>
+      </w:r>
+    </w:p>
+    <w:p>
+      <w:pPr>
+        <w:spacing w:before="100" w:beforeAutospacing="1" w:after="100" w:afterAutospacing="1" w:line="240" w:lineRule="auto"/>
+        <w:rPr>
+          <w:rFonts w:ascii="Times New Roman" w:eastAsia="Times New Roman" w:hAnsi="Times New Roman" w:cs="Times New Roman"/>
+          <w:kern w:val="0"/>
+          <w14:ligatures w14:val="none"/>
+        </w:rPr>
+      </w:pPr>
+      <w:r>
+        <w:rPr>
+          <w:rFonts w:ascii="Times New Roman" w:eastAsia="Times New Roman" w:hAnsi="Times New Roman" w:cs="Times New Roman"/>
+          <w:kern w:val="0"/>
+          <w14:ligatures w14:val="none"/>
+        </w:rPr>
+        <w:t>----------------</w:t>
+      </w:r>
+    </w:p>
+    <w:p>
+      <w:pPr>
+        <w:pStyle w:val="NormalWeb"/>
+      </w:pPr>
+      <w:r>
+        <w:rPr>
+          <w:b/>
+          <w:bCs/>
+        </w:rPr>
+        <w:t>My prompt</w:t>
+      </w:r>
+      <w:r>
+        <w:rPr>
+          <w:b/>
+          <w:bCs/>
+        </w:rPr>
+        <w:t xml:space="preserve">: </w:t>
+      </w:r>
+      <w:r>
+        <w:t>Traceback (most recent call last): File "/Users/izzybedichek/Desktop/imp/grad_school/data_mining/retail_inventory_twin/weather_api.py", line 43, in &lt;module&gt; daily_precipitation_sum = daily.Variables(4).ValuesAsNumpy() File "/Users/izzybedichek/Desktop/imp/grad_school/data_mining/retail_inventory_twin/.venv/lib/python3.13/site-packages/openmeteo_sdk/VariableWithValues.py", line 59, in ValuesAsNumpy o = flatbuffers.number_types.UOffsetTFlags.py_type(self._tab.Offset(10)) ~~~~~~~~~~~~~~~~^^^^ File "/Users/izzybedichek/Desktop/imp/grad_school/data_mining/retail_inventory_twin/.venv/lib/python3.13/site-packages/flatbuffers/table.py", line 39, in Offset vtable = self.Pos - self.Get(N.SOffsetTFlags, self.Pos) ~~~~~~~~^^^^^^^^^^^^^^^^^^^^^^^^^^^ File "/Users/izzybedichek/Desktop/imp/grad_school/data_mining/retail_inventory_twin/.venv/lib/python3.13/site-packages/flatbuffers/table.py", line 101, in Get return flags.py_type(encode.Get(flags.packer_type, self.Bytes, off)) ~~~~~~~~~~^^^^^^^^^^^^^^^^^^^^^^^^^^^^^^^^^^^^ File "/Users/izzybedichek/Desktop/imp/grad_school/data_mining/retail_inventory_twin/.venv/lib/python3.13/site-packages/flatbuffers/encode.py", line 27, in Get return packer_type.unpack_from(memoryview_type(buf), head)[0] ~~~~~~~~~~~~~~~~~~~~~~~^^^^^^^^^^^^^^^^^^^^^^^^^^^^ struct.error: unpack_from requires a buffer of at least 4294966958 bytes for unpacking 4 bytes at offset 4294966954 (actual buffer size is 1240) Coordinates: 37.3475456237793°N -121.8808364868164°E</w:t>
+      </w:r>
+    </w:p>
+    <w:p>
+      <w:pPr>
+        <w:rPr>
+          <w:b/>
+          <w:bCs/>
+        </w:rPr>
+      </w:pPr>
+      <w:r>
+        <w:rPr>
+          <w:b/>
+          <w:bCs/>
+        </w:rPr>
+        <w:t>Claude:</w:t>
+      </w:r>
+    </w:p>
+    <w:p>
+      <w:r>
+        <w:t xml:space="preserve">The variable indices are off. Just use the </w:t>
+      </w:r>
+      <w:r>
+        <w:rPr>
+          <w:rStyle w:val="Strong"/>
+        </w:rPr>
+        <w:t>simple requests approach</w:t>
+      </w:r>
+      <w:r>
+        <w:t xml:space="preserve"> instead — much easier to debug:</w:t>
+      </w:r>
+    </w:p>
+    <w:p>
+      <w:pPr>
+        <w:rPr>
+          <w:b/>
+          <w:bCs/>
+        </w:rPr>
+      </w:pPr>
+      <w:r>
+        <w:rPr>
+          <w:b/>
+          <w:bCs/>
+        </w:rPr>
+        <w:t>import requests</w:t>
+      </w:r>
+    </w:p>
+    <w:p>
+      <w:pPr>
+        <w:rPr>
+          <w:b/>
+          <w:bCs/>
+        </w:rPr>
+      </w:pPr>
+      <w:r>
+        <w:rPr>
+          <w:b/>
+          <w:bCs/>
+        </w:rPr>
+        <w:t>import pandas as pd</w:t>
+      </w:r>
+    </w:p>
+    <w:p>
+      <w:pPr>
+        <w:rPr>
+          <w:b/>
+          <w:bCs/>
+        </w:rPr>
+      </w:pPr>
+    </w:p>
+    <w:p>
+      <w:pPr>
+        <w:rPr>
+          <w:b/>
+          <w:bCs/>
+        </w:rPr>
+      </w:pPr>
+      <w:r>
+        <w:rPr>
+          <w:b/>
+          <w:bCs/>
+        </w:rPr>
+        <w:lastRenderedPageBreak/>
+        <w:t>params = {</w:t>
+      </w:r>
+    </w:p>
+    <w:p>
+      <w:pPr>
+        <w:rPr>
+          <w:b/>
+          <w:bCs/>
+        </w:rPr>
+      </w:pPr>
+      <w:r>
+        <w:rPr>
+          <w:b/>
+          <w:bCs/>
+        </w:rPr>
+        <w:t xml:space="preserve">    "latitude":   37.4419,</w:t>
+      </w:r>
+    </w:p>
+    <w:p>
+      <w:pPr>
+        <w:rPr>
+          <w:b/>
+          <w:bCs/>
+        </w:rPr>
+      </w:pPr>
+      <w:r>
+        <w:rPr>
+          <w:b/>
+          <w:bCs/>
+        </w:rPr>
+        <w:t xml:space="preserve">    "longitude":  -122.1430,</w:t>
+      </w:r>
+    </w:p>
+    <w:p>
+      <w:pPr>
+        <w:rPr>
+          <w:b/>
+          <w:bCs/>
+        </w:rPr>
+      </w:pPr>
+      <w:r>
+        <w:rPr>
+          <w:b/>
+          <w:bCs/>
+        </w:rPr>
+        <w:t xml:space="preserve">    "start_date": "2024-12-01",</w:t>
+      </w:r>
+    </w:p>
+    <w:p>
+      <w:pPr>
+        <w:rPr>
+          <w:b/>
+          <w:bCs/>
+        </w:rPr>
+      </w:pPr>
+      <w:r>
+        <w:rPr>
+          <w:b/>
+          <w:bCs/>
+        </w:rPr>
+        <w:t xml:space="preserve">    "end_date":   "2025-03-01",</w:t>
+      </w:r>
+    </w:p>
+    <w:p>
+      <w:pPr>
+        <w:rPr>
+          <w:b/>
+          <w:bCs/>
+        </w:rPr>
+      </w:pPr>
+      <w:r>
+        <w:rPr>
+          <w:b/>
+          <w:bCs/>
+        </w:rPr>
+        <w:t xml:space="preserve">    "daily":      "temperature_2m_max,temperature_2m_min,precipitation_sum,rain_sum,snowfall_sum,cloud_cover_mean",</w:t>
+      </w:r>
+    </w:p>
+    <w:p>
+      <w:pPr>
+        <w:rPr>
+          <w:b/>
+          <w:bCs/>
+        </w:rPr>
+      </w:pPr>
+      <w:r>
+        <w:rPr>
+          <w:b/>
+          <w:bCs/>
+        </w:rPr>
+        <w:t xml:space="preserve">    "timezone":   "America/Los_Angeles",</w:t>
+      </w:r>
+    </w:p>
+    <w:p>
+      <w:pPr>
+        <w:rPr>
+          <w:b/>
+          <w:bCs/>
+        </w:rPr>
+      </w:pPr>
+      <w:r>
+        <w:rPr>
+          <w:b/>
+          <w:bCs/>
+        </w:rPr>
+        <w:t>}</w:t>
+      </w:r>
+    </w:p>
+    <w:p>
+      <w:pPr>
+        <w:rPr>
+          <w:b/>
+          <w:bCs/>
+        </w:rPr>
+      </w:pPr>
+    </w:p>
+    <w:p>
+      <w:pPr>
+        <w:rPr>
+          <w:b/>
+          <w:bCs/>
+        </w:rPr>
+      </w:pPr>
+      <w:r>
+        <w:rPr>
+          <w:b/>
+          <w:bCs/>
+        </w:rPr>
+        <w:t>r    = requests.get("https://archive-api.open-meteo.com/v1/archive", params=params)</w:t>
+      </w:r>
+    </w:p>
+    <w:p>
+      <w:pPr>
+        <w:rPr>
+          <w:b/>
+          <w:bCs/>
+        </w:rPr>
+      </w:pPr>
+      <w:r>
+        <w:rPr>
+          <w:b/>
+          <w:bCs/>
+        </w:rPr>
+        <w:t>data = r.json()</w:t>
+      </w:r>
+    </w:p>
+    <w:p>
+      <w:pPr>
+        <w:rPr>
+          <w:b/>
+          <w:bCs/>
+        </w:rPr>
+      </w:pPr>
+    </w:p>
+    <w:p>
+      <w:pPr>
+        <w:rPr>
+          <w:b/>
+          <w:bCs/>
+        </w:rPr>
+      </w:pPr>
+      <w:r>
+        <w:rPr>
+          <w:b/>
+          <w:bCs/>
+        </w:rPr>
+        <w:t>df = pd.DataFrame(data["daily"])</w:t>
+      </w:r>
+    </w:p>
+    <w:p>
+      <w:pPr>
+        <w:rPr>
+          <w:b/>
+          <w:bCs/>
+        </w:rPr>
+      </w:pPr>
+      <w:r>
+        <w:rPr>
+          <w:b/>
+          <w:bCs/>
+        </w:rPr>
+        <w:t>df["time"] = pd.to_datetime(df["time"])</w:t>
+      </w:r>
+    </w:p>
+    <w:p>
+      <w:pPr>
+        <w:rPr>
+          <w:b/>
+          <w:bCs/>
+        </w:rPr>
+      </w:pPr>
+      <w:r>
+        <w:rPr>
+          <w:b/>
+          <w:bCs/>
+        </w:rPr>
+        <w:t>df = df.set_index("time")</w:t>
+      </w:r>
+    </w:p>
+    <w:p>
+      <w:pPr>
+        <w:rPr>
+          <w:b/>
+          <w:bCs/>
+        </w:rPr>
+      </w:pPr>
+      <w:r>
+        <w:rPr>
+          <w:b/>
+          <w:bCs/>
+        </w:rPr>
+        <w:t>df.columns = ["temp_max_c", "temp_min_c", "precip_mm", "rain_mm", "snowfall_cm", "cloud_cover_%"]</w:t>
+      </w:r>
+    </w:p>
+    <w:p>
+      <w:pPr>
+        <w:rPr>
+          <w:b/>
+          <w:bCs/>
+        </w:rPr>
+      </w:pPr>
+    </w:p>
+    <w:p>
+      <w:pPr>
+        <w:rPr>
+          <w:b/>
+          <w:bCs/>
+        </w:rPr>
+      </w:pPr>
+      <w:r>
+        <w:rPr>
+          <w:b/>
+          <w:bCs/>
+        </w:rPr>
+        <w:t>print(df.head(10))</w:t>
+      </w:r>
+    </w:p>
+    <w:p>
+      <w:pPr>
+        <w:rPr>
+          <w:b/>
+          <w:bCs/>
+        </w:rPr>
+      </w:pPr>
+      <w:r>
+        <w:rPr>
+          <w:b/>
+          <w:bCs/>
+        </w:rPr>
+        <w:t>df.to_csv("palo_alto_weather.csv")</w:t>
+      </w:r>
+    </w:p>
+    <w:p>
+      <w:r>
+        <w:t>No SDK, no flatbuffers, no index guessing — just plain JSON straight into a dataframe. Run this and it should work immediately.</w:t>
+      </w:r>
+    </w:p>
+    <w:p>
+      <w:r>
+        <w:t>----------------------------------</w:t>
+      </w:r>
+    </w:p>
+    <w:p>
+      <w:pPr>
+        <w:pStyle w:val="NormalWeb"/>
+      </w:pPr>
+      <w:r>
+        <w:t xml:space="preserve">My prompt: </w:t>
+      </w:r>
+      <w:r>
+        <w:t>edit this so that it erases the existing wrong database and subs in the new import sqlite3</w:t>
+      </w:r>
+    </w:p>
+    <w:p>
+      <w:pPr>
+        <w:spacing w:before="100" w:beforeAutospacing="1" w:after="100" w:afterAutospacing="1" w:line="240" w:lineRule="auto"/>
+        <w:outlineLvl w:val="0"/>
+        <w:rPr>
+          <w:rFonts w:ascii="Times New Roman" w:eastAsia="Times New Roman" w:hAnsi="Times New Roman" w:cs="Times New Roman"/>
+          <w:b/>
+          <w:bCs/>
+          <w:kern w:val="36"/>
+          <w:sz w:val="48"/>
+          <w:szCs w:val="48"/>
+          <w14:ligatures w14:val="none"/>
+        </w:rPr>
+      </w:pPr>
+      <w:r>
+        <w:rPr>
+          <w:rFonts w:ascii="Times New Roman" w:eastAsia="Times New Roman" w:hAnsi="Times New Roman" w:cs="Times New Roman"/>
+          <w:b/>
+          <w:bCs/>
+          <w:kern w:val="36"/>
+          <w:sz w:val="48"/>
+          <w:szCs w:val="48"/>
+          <w14:ligatures w14:val="none"/>
+        </w:rPr>
+        <w:lastRenderedPageBreak/>
+        <w:t>ref https://sqldocs.org/sqlite-create-database/, https://docs.python.org/3/library/sqlite3.html</w:t>
+      </w:r>
+    </w:p>
+    <w:p>
+      <w:pPr>
+        <w:spacing w:before="100" w:beforeAutospacing="1" w:after="100" w:afterAutospacing="1" w:line="240" w:lineRule="auto"/>
+        <w:rPr>
+          <w:rFonts w:ascii="Times New Roman" w:eastAsia="Times New Roman" w:hAnsi="Times New Roman" w:cs="Times New Roman"/>
+          <w:kern w:val="0"/>
+          <w14:ligatures w14:val="none"/>
+        </w:rPr>
+      </w:pPr>
+      <w:r>
+        <w:rPr>
+          <w:rFonts w:ascii="Times New Roman" w:eastAsia="Times New Roman" w:hAnsi="Times New Roman" w:cs="Times New Roman"/>
+          <w:kern w:val="0"/>
+          <w14:ligatures w14:val="none"/>
+        </w:rPr>
+        <w:t>connection = sqlite3.connect('inventory.db')</w:t>
+      </w:r>
+    </w:p>
+    <w:p>
+      <w:pPr>
+        <w:spacing w:before="100" w:beforeAutospacing="1" w:after="100" w:afterAutospacing="1" w:line="240" w:lineRule="auto"/>
+        <w:outlineLvl w:val="0"/>
+        <w:rPr>
+          <w:rFonts w:ascii="Times New Roman" w:eastAsia="Times New Roman" w:hAnsi="Times New Roman" w:cs="Times New Roman"/>
+          <w:b/>
+          <w:bCs/>
+          <w:kern w:val="36"/>
+          <w:sz w:val="48"/>
+          <w:szCs w:val="48"/>
+          <w14:ligatures w14:val="none"/>
+        </w:rPr>
+      </w:pPr>
+      <w:r>
+        <w:rPr>
+          <w:rFonts w:ascii="Times New Roman" w:eastAsia="Times New Roman" w:hAnsi="Times New Roman" w:cs="Times New Roman"/>
+          <w:b/>
+          <w:bCs/>
+          <w:kern w:val="36"/>
+          <w:sz w:val="48"/>
+          <w:szCs w:val="48"/>
+          <w14:ligatures w14:val="none"/>
+        </w:rPr>
+        <w:t>needed to execute queries</w:t>
+      </w:r>
+    </w:p>
+    <w:p>
+      <w:pPr>
+        <w:spacing w:before="100" w:beforeAutospacing="1" w:after="100" w:afterAutospacing="1" w:line="240" w:lineRule="auto"/>
+        <w:rPr>
+          <w:rFonts w:ascii="Times New Roman" w:eastAsia="Times New Roman" w:hAnsi="Times New Roman" w:cs="Times New Roman"/>
+          <w:kern w:val="0"/>
+          <w14:ligatures w14:val="none"/>
+        </w:rPr>
+      </w:pPr>
+      <w:r>
+        <w:rPr>
+          <w:rFonts w:ascii="Times New Roman" w:eastAsia="Times New Roman" w:hAnsi="Times New Roman" w:cs="Times New Roman"/>
+          <w:kern w:val="0"/>
+          <w14:ligatures w14:val="none"/>
+        </w:rPr>
+        <w:t>cur = connection.cursor()</w:t>
+      </w:r>
+    </w:p>
+    <w:p>
+      <w:pPr>
+        <w:spacing w:before="100" w:beforeAutospacing="1" w:after="100" w:afterAutospacing="1" w:line="240" w:lineRule="auto"/>
+        <w:outlineLvl w:val="0"/>
+        <w:rPr>
+          <w:rFonts w:ascii="Times New Roman" w:eastAsia="Times New Roman" w:hAnsi="Times New Roman" w:cs="Times New Roman"/>
+          <w:b/>
+          <w:bCs/>
+          <w:kern w:val="36"/>
+          <w:sz w:val="48"/>
+          <w:szCs w:val="48"/>
+          <w14:ligatures w14:val="none"/>
+        </w:rPr>
+      </w:pPr>
+      <w:r>
+        <w:rPr>
+          <w:rFonts w:ascii="Times New Roman" w:eastAsia="Times New Roman" w:hAnsi="Times New Roman" w:cs="Times New Roman"/>
+          <w:b/>
+          <w:bCs/>
+          <w:kern w:val="36"/>
+          <w:sz w:val="48"/>
+          <w:szCs w:val="48"/>
+          <w14:ligatures w14:val="none"/>
+        </w:rPr>
+        <w:t>using https://www.w3resource.com/projects/sql/sql-projects-on-inventory-management-system.php</w:t>
+      </w:r>
+    </w:p>
+    <w:p>
+      <w:pPr>
+        <w:spacing w:before="100" w:beforeAutospacing="1" w:after="100" w:afterAutospacing="1" w:line="240" w:lineRule="auto"/>
+        <w:outlineLvl w:val="0"/>
+        <w:rPr>
+          <w:rFonts w:ascii="Times New Roman" w:eastAsia="Times New Roman" w:hAnsi="Times New Roman" w:cs="Times New Roman"/>
+          <w:b/>
+          <w:bCs/>
+          <w:kern w:val="36"/>
+          <w:sz w:val="48"/>
+          <w:szCs w:val="48"/>
+          <w14:ligatures w14:val="none"/>
+        </w:rPr>
+      </w:pPr>
+      <w:r>
+        <w:rPr>
+          <w:rFonts w:ascii="Times New Roman" w:eastAsia="Times New Roman" w:hAnsi="Times New Roman" w:cs="Times New Roman"/>
+          <w:b/>
+          <w:bCs/>
+          <w:kern w:val="36"/>
+          <w:sz w:val="48"/>
+          <w:szCs w:val="48"/>
+          <w14:ligatures w14:val="none"/>
+        </w:rPr>
+        <w:t>database structure</w:t>
+      </w:r>
+    </w:p>
+    <w:p>
+      <w:pPr>
+        <w:spacing w:before="100" w:beforeAutospacing="1" w:after="100" w:afterAutospacing="1" w:line="240" w:lineRule="auto"/>
+        <w:rPr>
+          <w:rFonts w:ascii="Times New Roman" w:eastAsia="Times New Roman" w:hAnsi="Times New Roman" w:cs="Times New Roman"/>
+          <w:kern w:val="0"/>
+          <w14:ligatures w14:val="none"/>
+        </w:rPr>
+      </w:pPr>
+      <w:r>
+        <w:rPr>
+          <w:rFonts w:ascii="Times New Roman" w:eastAsia="Times New Roman" w:hAnsi="Times New Roman" w:cs="Times New Roman"/>
+          <w:kern w:val="0"/>
+          <w14:ligatures w14:val="none"/>
+        </w:rPr>
+        <w:t>cur.execute("CREATE TABLE Products(product_id INT PRIMARY KEY," "product_name VARCHAR(255) NOT NULL," "price DECIMAL(10, 2) NOT NULL," "category VARCHAR(100));")</w:t>
+      </w:r>
+    </w:p>
+    <w:p>
+      <w:pPr>
+        <w:spacing w:before="100" w:beforeAutospacing="1" w:after="100" w:afterAutospacing="1" w:line="240" w:lineRule="auto"/>
+        <w:rPr>
+          <w:rFonts w:ascii="Times New Roman" w:eastAsia="Times New Roman" w:hAnsi="Times New Roman" w:cs="Times New Roman"/>
+          <w:kern w:val="0"/>
+          <w14:ligatures w14:val="none"/>
+        </w:rPr>
+      </w:pPr>
+      <w:r>
+        <w:rPr>
+          <w:rFonts w:ascii="Times New Roman" w:eastAsia="Times New Roman" w:hAnsi="Times New Roman" w:cs="Times New Roman"/>
+          <w:kern w:val="0"/>
+          <w14:ligatures w14:val="none"/>
+        </w:rPr>
+        <w:t>cur.execute("CREATE TABLE Suppliers (" "supplier_id INT PRIMARY KEY," "supplier_name VARCHAR(255) NOT NULL," "contact_email VARCHAR(255)," "phone_number VARCHAR(15));")</w:t>
+      </w:r>
+    </w:p>
+    <w:p>
+      <w:pPr>
+        <w:spacing w:before="100" w:beforeAutospacing="1" w:after="100" w:afterAutospacing="1" w:line="240" w:lineRule="auto"/>
+        <w:rPr>
+          <w:rFonts w:ascii="Times New Roman" w:eastAsia="Times New Roman" w:hAnsi="Times New Roman" w:cs="Times New Roman"/>
+          <w:kern w:val="0"/>
+          <w14:ligatures w14:val="none"/>
+        </w:rPr>
+      </w:pPr>
+      <w:r>
+        <w:rPr>
+          <w:rFonts w:ascii="Times New Roman" w:eastAsia="Times New Roman" w:hAnsi="Times New Roman" w:cs="Times New Roman"/>
+          <w:kern w:val="0"/>
+          <w14:ligatures w14:val="none"/>
+        </w:rPr>
+        <w:t>cur.execute("CREATE TABLE Inventory (" "record_id INT PRIMARY KEY," "product_id INT," "record_date DATE NOT NULL," "quantity INT DEFAULT 0," "supplier_id INT," "FOREIGN KEY (product_id) REFERENCES Products(product_id);")</w:t>
+      </w:r>
+    </w:p>
+    <w:p>
+      <w:pPr>
+        <w:spacing w:before="100" w:beforeAutospacing="1" w:after="100" w:afterAutospacing="1" w:line="240" w:lineRule="auto"/>
+        <w:rPr>
+          <w:rFonts w:ascii="Times New Roman" w:eastAsia="Times New Roman" w:hAnsi="Times New Roman" w:cs="Times New Roman"/>
+          <w:kern w:val="0"/>
+          <w14:ligatures w14:val="none"/>
+        </w:rPr>
+      </w:pPr>
+      <w:r>
+        <w:rPr>
+          <w:rFonts w:ascii="Times New Roman" w:eastAsia="Times New Roman" w:hAnsi="Times New Roman" w:cs="Times New Roman"/>
+          <w:kern w:val="0"/>
+          <w14:ligatures w14:val="none"/>
+        </w:rPr>
+        <w:t>cur.execute("CREATE TABLE Transactions (" "transaction_id INT PRIMARY KEY," "product_id INT," "transaction_type TEXT CHECK(transaction_type IN ('sale', 'purchase')) NOT NULL," "transaction_date DATE DEFAULT (CURRENT_DATE)," "quantity INT NOT NULL," "FOREIGN KEY (product_id) REFERENCES Products(product_id));")</w:t>
+      </w:r>
+    </w:p>
+    <w:p>
+      <w:pPr>
+        <w:spacing w:before="100" w:beforeAutospacing="1" w:after="100" w:afterAutospacing="1" w:line="240" w:lineRule="auto"/>
+        <w:rPr>
+          <w:rFonts w:ascii="Times New Roman" w:eastAsia="Times New Roman" w:hAnsi="Times New Roman" w:cs="Times New Roman"/>
+          <w:kern w:val="0"/>
+          <w14:ligatures w14:val="none"/>
+        </w:rPr>
+      </w:pPr>
+      <w:r>
+        <w:rPr>
+          <w:rFonts w:ascii="Times New Roman" w:eastAsia="Times New Roman" w:hAnsi="Times New Roman" w:cs="Times New Roman"/>
+          <w:kern w:val="0"/>
+          <w14:ligatures w14:val="none"/>
+        </w:rPr>
+        <w:t>connection.commit() connection.close()</w:t>
+      </w:r>
+    </w:p>
+    <w:p>
+      <w:pPr>
+        <w:rPr>
+          <w:b/>
+          <w:bCs/>
+        </w:rPr>
+      </w:pPr>
+      <w:r>
+        <w:rPr>
+          <w:b/>
+          <w:bCs/>
+        </w:rPr>
+        <w:t xml:space="preserve">Claude: </w:t>
+      </w:r>
+      <w:r>
+        <w:rPr>
+          <w:b/>
+          <w:bCs/>
+        </w:rPr>
+        <w:t>import sqlite3</w:t>
+      </w:r>
+    </w:p>
+    <w:p>
+      <w:pPr>
+        <w:rPr>
+          <w:b/>
+          <w:bCs/>
+        </w:rPr>
+      </w:pPr>
+      <w:r>
+        <w:rPr>
+          <w:b/>
+          <w:bCs/>
+        </w:rPr>
+        <w:t>import os</w:t>
+      </w:r>
+    </w:p>
+    <w:p>
+      <w:pPr>
+        <w:rPr>
+          <w:b/>
+          <w:bCs/>
+        </w:rPr>
+      </w:pPr>
+    </w:p>
+    <w:p>
+      <w:pPr>
+        <w:rPr>
+          <w:b/>
+          <w:bCs/>
+        </w:rPr>
+      </w:pPr>
+      <w:r>
+        <w:rPr>
+          <w:b/>
+          <w:bCs/>
+        </w:rPr>
+        <w:t># wipe existing database</w:t>
+      </w:r>
+    </w:p>
+    <w:p>
+      <w:pPr>
+        <w:rPr>
+          <w:b/>
+          <w:bCs/>
+        </w:rPr>
+      </w:pPr>
+      <w:r>
+        <w:rPr>
+          <w:b/>
+          <w:bCs/>
+        </w:rPr>
+        <w:t>if os.path.exists('inventory.db'):</w:t>
+      </w:r>
+    </w:p>
+    <w:p>
+      <w:pPr>
+        <w:rPr>
+          <w:b/>
+          <w:bCs/>
+        </w:rPr>
+      </w:pPr>
+      <w:r>
+        <w:rPr>
+          <w:b/>
+          <w:bCs/>
+        </w:rPr>
+        <w:t xml:space="preserve">    os.remove('inventory.db')</w:t>
+      </w:r>
+    </w:p>
+    <w:p>
+      <w:pPr>
+        <w:rPr>
+          <w:b/>
+          <w:bCs/>
+        </w:rPr>
+      </w:pPr>
+    </w:p>
+    <w:p>
+      <w:pPr>
+        <w:rPr>
+          <w:b/>
+          <w:bCs/>
+        </w:rPr>
+      </w:pPr>
+      <w:r>
+        <w:rPr>
+          <w:b/>
+          <w:bCs/>
+        </w:rPr>
+        <w:t>connection = sqlite3.connect('inventory.db')</w:t>
+      </w:r>
+    </w:p>
+    <w:p>
+      <w:pPr>
+        <w:rPr>
+          <w:b/>
+          <w:bCs/>
+        </w:rPr>
+      </w:pPr>
+      <w:r>
+        <w:rPr>
+          <w:b/>
+          <w:bCs/>
+        </w:rPr>
+        <w:t>cur = connection.cursor()</w:t>
+      </w:r>
+    </w:p>
+    <w:p>
+      <w:pPr>
+        <w:rPr>
+          <w:b/>
+          <w:bCs/>
+        </w:rPr>
+      </w:pPr>
+    </w:p>
+    <w:p>
+      <w:pPr>
+        <w:rPr>
+          <w:b/>
+          <w:bCs/>
+        </w:rPr>
+      </w:pPr>
+      <w:r>
+        <w:rPr>
+          <w:b/>
+          <w:bCs/>
+        </w:rPr>
+        <w:t>cur.execute("PRAGMA foreign_keys = ON;")</w:t>
+      </w:r>
+    </w:p>
+    <w:p>
+      <w:pPr>
+        <w:rPr>
+          <w:b/>
+          <w:bCs/>
+        </w:rPr>
+      </w:pPr>
+    </w:p>
+    <w:p>
+      <w:pPr>
+        <w:rPr>
+          <w:b/>
+          <w:bCs/>
+        </w:rPr>
+      </w:pPr>
+      <w:r>
+        <w:rPr>
+          <w:b/>
+          <w:bCs/>
+        </w:rPr>
+        <w:t>cur.execute("""</w:t>
+      </w:r>
+    </w:p>
+    <w:p>
+      <w:pPr>
+        <w:rPr>
+          <w:b/>
+          <w:bCs/>
+        </w:rPr>
+      </w:pPr>
+      <w:r>
+        <w:rPr>
+          <w:b/>
+          <w:bCs/>
+        </w:rPr>
+        <w:t xml:space="preserve">    CREATE TABLE Products (</w:t>
+      </w:r>
+    </w:p>
+    <w:p>
+      <w:pPr>
+        <w:rPr>
+          <w:b/>
+          <w:bCs/>
+        </w:rPr>
+      </w:pPr>
+      <w:r>
+        <w:rPr>
+          <w:b/>
+          <w:bCs/>
+        </w:rPr>
+        <w:t xml:space="preserve">        product_id   INT PRIMARY KEY,</w:t>
+      </w:r>
+    </w:p>
+    <w:p>
+      <w:pPr>
+        <w:rPr>
+          <w:b/>
+          <w:bCs/>
+        </w:rPr>
+      </w:pPr>
+      <w:r>
+        <w:rPr>
+          <w:b/>
+          <w:bCs/>
+        </w:rPr>
+        <w:t xml:space="preserve">        product_name VARCHAR(255) NOT NULL,</w:t>
+      </w:r>
+    </w:p>
+    <w:p>
+      <w:pPr>
+        <w:rPr>
+          <w:b/>
+          <w:bCs/>
+        </w:rPr>
+      </w:pPr>
+      <w:r>
+        <w:rPr>
+          <w:b/>
+          <w:bCs/>
+        </w:rPr>
+        <w:t xml:space="preserve">        price        DECIMAL(10, 2) NOT NULL,</w:t>
+      </w:r>
+    </w:p>
+    <w:p>
+      <w:pPr>
+        <w:rPr>
+          <w:b/>
+          <w:bCs/>
+        </w:rPr>
+      </w:pPr>
+      <w:r>
+        <w:rPr>
+          <w:b/>
+          <w:bCs/>
+        </w:rPr>
+        <w:t xml:space="preserve">        category     VARCHAR(100),</w:t>
+      </w:r>
+    </w:p>
+    <w:p>
+      <w:pPr>
+        <w:rPr>
+          <w:b/>
+          <w:bCs/>
+        </w:rPr>
+      </w:pPr>
+      <w:r>
+        <w:rPr>
+          <w:b/>
+          <w:bCs/>
+        </w:rPr>
+        <w:t xml:space="preserve">        reorder_point INT DEFAULT 10,</w:t>
+      </w:r>
+    </w:p>
+    <w:p>
+      <w:pPr>
+        <w:rPr>
+          <w:b/>
+          <w:bCs/>
+        </w:rPr>
+      </w:pPr>
+      <w:r>
+        <w:rPr>
+          <w:b/>
+          <w:bCs/>
+        </w:rPr>
+        <w:t xml:space="preserve">        reorder_qty   INT DEFAULT 100</w:t>
+      </w:r>
+    </w:p>
+    <w:p>
+      <w:pPr>
+        <w:rPr>
+          <w:b/>
+          <w:bCs/>
+        </w:rPr>
+      </w:pPr>
+      <w:r>
+        <w:rPr>
+          <w:b/>
+          <w:bCs/>
+        </w:rPr>
+        <w:t xml:space="preserve">    )</w:t>
+      </w:r>
+    </w:p>
+    <w:p>
+      <w:pPr>
+        <w:rPr>
+          <w:b/>
+          <w:bCs/>
+        </w:rPr>
+      </w:pPr>
+      <w:r>
+        <w:rPr>
+          <w:b/>
+          <w:bCs/>
+        </w:rPr>
+        <w:t>""")</w:t>
+      </w:r>
+    </w:p>
+    <w:p>
+      <w:pPr>
+        <w:rPr>
+          <w:b/>
+          <w:bCs/>
+        </w:rPr>
+      </w:pPr>
+    </w:p>
+    <w:p>
+      <w:pPr>
+        <w:rPr>
+          <w:b/>
+          <w:bCs/>
+        </w:rPr>
+      </w:pPr>
+      <w:r>
+        <w:rPr>
+          <w:b/>
+          <w:bCs/>
+        </w:rPr>
+        <w:t>cur.execute("""</w:t>
+      </w:r>
+    </w:p>
+    <w:p>
+      <w:pPr>
+        <w:rPr>
+          <w:b/>
+          <w:bCs/>
+        </w:rPr>
+      </w:pPr>
+      <w:r>
+        <w:rPr>
+          <w:b/>
+          <w:bCs/>
+        </w:rPr>
+        <w:t xml:space="preserve">    CREATE TABLE Suppliers (</w:t>
+      </w:r>
+    </w:p>
+    <w:p>
+      <w:pPr>
+        <w:rPr>
+          <w:b/>
+          <w:bCs/>
+        </w:rPr>
+      </w:pPr>
+      <w:r>
+        <w:rPr>
+          <w:b/>
+          <w:bCs/>
+        </w:rPr>
+        <w:t xml:space="preserve">        supplier_id   INT PRIMARY KEY,</w:t>
+      </w:r>
+    </w:p>
+    <w:p>
+      <w:pPr>
+        <w:rPr>
+          <w:b/>
+          <w:bCs/>
+        </w:rPr>
+      </w:pPr>
+      <w:r>
+        <w:rPr>
+          <w:b/>
+          <w:bCs/>
+        </w:rPr>
+        <w:t xml:space="preserve">        supplier_name VARCHAR(255) NOT NULL,</w:t>
+      </w:r>
+    </w:p>
+    <w:p>
+      <w:pPr>
+        <w:rPr>
+          <w:b/>
+          <w:bCs/>
+        </w:rPr>
+      </w:pPr>
+      <w:r>
+        <w:rPr>
+          <w:b/>
+          <w:bCs/>
+        </w:rPr>
+        <w:t xml:space="preserve">        contact_email VARCHAR(255),</w:t>
+      </w:r>
+    </w:p>
+    <w:p>
+      <w:pPr>
+        <w:rPr>
+          <w:b/>
+          <w:bCs/>
+        </w:rPr>
+      </w:pPr>
+      <w:r>
+        <w:rPr>
+          <w:b/>
+          <w:bCs/>
+        </w:rPr>
+        <w:lastRenderedPageBreak/>
+        <w:t xml:space="preserve">        phone_number  VARCHAR(15),</w:t>
+      </w:r>
+    </w:p>
+    <w:p>
+      <w:pPr>
+        <w:rPr>
+          <w:b/>
+          <w:bCs/>
+        </w:rPr>
+      </w:pPr>
+      <w:r>
+        <w:rPr>
+          <w:b/>
+          <w:bCs/>
+        </w:rPr>
+        <w:t xml:space="preserve">        lead_time_days INT DEFAULT 3</w:t>
+      </w:r>
+    </w:p>
+    <w:p>
+      <w:pPr>
+        <w:rPr>
+          <w:b/>
+          <w:bCs/>
+        </w:rPr>
+      </w:pPr>
+      <w:r>
+        <w:rPr>
+          <w:b/>
+          <w:bCs/>
+        </w:rPr>
+        <w:t xml:space="preserve">    )</w:t>
+      </w:r>
+    </w:p>
+    <w:p>
+      <w:pPr>
+        <w:rPr>
+          <w:b/>
+          <w:bCs/>
+        </w:rPr>
+      </w:pPr>
+      <w:r>
+        <w:rPr>
+          <w:b/>
+          <w:bCs/>
+        </w:rPr>
+        <w:t>""")</w:t>
+      </w:r>
+    </w:p>
+    <w:p>
+      <w:pPr>
+        <w:rPr>
+          <w:b/>
+          <w:bCs/>
+        </w:rPr>
+      </w:pPr>
+    </w:p>
+    <w:p>
+      <w:pPr>
+        <w:rPr>
+          <w:b/>
+          <w:bCs/>
+        </w:rPr>
+      </w:pPr>
+      <w:r>
+        <w:rPr>
+          <w:b/>
+          <w:bCs/>
+        </w:rPr>
+        <w:t>cur.execute("""</w:t>
+      </w:r>
+    </w:p>
+    <w:p>
+      <w:pPr>
+        <w:rPr>
+          <w:b/>
+          <w:bCs/>
+        </w:rPr>
+      </w:pPr>
+      <w:r>
+        <w:rPr>
+          <w:b/>
+          <w:bCs/>
+        </w:rPr>
+        <w:t xml:space="preserve">    CREATE TABLE Product_Suppliers (</w:t>
+      </w:r>
+    </w:p>
+    <w:p>
+      <w:pPr>
+        <w:rPr>
+          <w:b/>
+          <w:bCs/>
+        </w:rPr>
+      </w:pPr>
+      <w:r>
+        <w:rPr>
+          <w:b/>
+          <w:bCs/>
+        </w:rPr>
+        <w:t xml:space="preserve">        product_id  INT,</w:t>
+      </w:r>
+    </w:p>
+    <w:p>
+      <w:pPr>
+        <w:rPr>
+          <w:b/>
+          <w:bCs/>
+        </w:rPr>
+      </w:pPr>
+      <w:r>
+        <w:rPr>
+          <w:b/>
+          <w:bCs/>
+        </w:rPr>
+        <w:t xml:space="preserve">        supplier_id INT,</w:t>
+      </w:r>
+    </w:p>
+    <w:p>
+      <w:pPr>
+        <w:rPr>
+          <w:b/>
+          <w:bCs/>
+        </w:rPr>
+      </w:pPr>
+      <w:r>
+        <w:rPr>
+          <w:b/>
+          <w:bCs/>
+        </w:rPr>
+        <w:t xml:space="preserve">        PRIMARY KEY (product_id, supplier_id),</w:t>
+      </w:r>
+    </w:p>
+    <w:p>
+      <w:pPr>
+        <w:rPr>
+          <w:b/>
+          <w:bCs/>
+        </w:rPr>
+      </w:pPr>
+      <w:r>
+        <w:rPr>
+          <w:b/>
+          <w:bCs/>
+        </w:rPr>
+        <w:t xml:space="preserve">        FOREIGN KEY (product_id)  REFERENCES Products(product_id),</w:t>
+      </w:r>
+    </w:p>
+    <w:p>
+      <w:pPr>
+        <w:rPr>
+          <w:b/>
+          <w:bCs/>
+        </w:rPr>
+      </w:pPr>
+      <w:r>
+        <w:rPr>
+          <w:b/>
+          <w:bCs/>
+        </w:rPr>
+        <w:t xml:space="preserve">        FOREIGN KEY (supplier_id) REFERENCES Suppliers(supplier_id)</w:t>
+      </w:r>
+    </w:p>
+    <w:p>
+      <w:pPr>
+        <w:rPr>
+          <w:b/>
+          <w:bCs/>
+        </w:rPr>
+      </w:pPr>
+      <w:r>
+        <w:rPr>
+          <w:b/>
+          <w:bCs/>
+        </w:rPr>
+        <w:t xml:space="preserve">    )</w:t>
+      </w:r>
+    </w:p>
+    <w:p>
+      <w:pPr>
+        <w:rPr>
+          <w:b/>
+          <w:bCs/>
+        </w:rPr>
+      </w:pPr>
+      <w:r>
+        <w:rPr>
+          <w:b/>
+          <w:bCs/>
+        </w:rPr>
+        <w:t>""")</w:t>
+      </w:r>
+    </w:p>
+    <w:p>
+      <w:pPr>
+        <w:rPr>
+          <w:b/>
+          <w:bCs/>
+        </w:rPr>
+      </w:pPr>
+    </w:p>
+    <w:p>
+      <w:pPr>
+        <w:rPr>
+          <w:b/>
+          <w:bCs/>
+        </w:rPr>
+      </w:pPr>
+      <w:r>
+        <w:rPr>
+          <w:b/>
+          <w:bCs/>
+        </w:rPr>
+        <w:t>cur.execute("""</w:t>
+      </w:r>
+    </w:p>
+    <w:p>
+      <w:pPr>
+        <w:rPr>
+          <w:b/>
+          <w:bCs/>
+        </w:rPr>
+      </w:pPr>
+      <w:r>
+        <w:rPr>
+          <w:b/>
+          <w:bCs/>
+        </w:rPr>
+        <w:t xml:space="preserve">    CREATE TABLE Daily_Inventory (</w:t>
+      </w:r>
+    </w:p>
+    <w:p>
+      <w:pPr>
+        <w:rPr>
+          <w:b/>
+          <w:bCs/>
+        </w:rPr>
+      </w:pPr>
+      <w:r>
+        <w:rPr>
+          <w:b/>
+          <w:bCs/>
+        </w:rPr>
+        <w:t xml:space="preserve">        record_id   INTEGER PRIMARY KEY AUTOINCREMENT,</w:t>
+      </w:r>
+    </w:p>
+    <w:p>
+      <w:pPr>
+        <w:rPr>
+          <w:b/>
+          <w:bCs/>
+        </w:rPr>
+      </w:pPr>
+      <w:r>
+        <w:rPr>
+          <w:b/>
+          <w:bCs/>
+        </w:rPr>
+        <w:t xml:space="preserve">        product_id  INT NOT NULL,</w:t>
+      </w:r>
+    </w:p>
+    <w:p>
+      <w:pPr>
+        <w:rPr>
+          <w:b/>
+          <w:bCs/>
+        </w:rPr>
+      </w:pPr>
+      <w:r>
+        <w:rPr>
+          <w:b/>
+          <w:bCs/>
+        </w:rPr>
+        <w:t xml:space="preserve">        record_date DATE NOT NULL DEFAULT (CURRENT_DATE),</w:t>
+      </w:r>
+    </w:p>
+    <w:p>
+      <w:pPr>
+        <w:rPr>
+          <w:b/>
+          <w:bCs/>
+        </w:rPr>
+      </w:pPr>
+      <w:r>
+        <w:rPr>
+          <w:b/>
+          <w:bCs/>
+        </w:rPr>
+        <w:t xml:space="preserve">        quantity    INT NOT NULL,</w:t>
+      </w:r>
+    </w:p>
+    <w:p>
+      <w:pPr>
+        <w:rPr>
+          <w:b/>
+          <w:bCs/>
+        </w:rPr>
+      </w:pPr>
+      <w:r>
+        <w:rPr>
+          <w:b/>
+          <w:bCs/>
+        </w:rPr>
+        <w:t xml:space="preserve">        counted_by  VARCHAR(255),</w:t>
+      </w:r>
+    </w:p>
+    <w:p>
+      <w:pPr>
+        <w:rPr>
+          <w:b/>
+          <w:bCs/>
+        </w:rPr>
+      </w:pPr>
+      <w:r>
+        <w:rPr>
+          <w:b/>
+          <w:bCs/>
+        </w:rPr>
+        <w:t xml:space="preserve">        notes       TEXT,</w:t>
+      </w:r>
+    </w:p>
+    <w:p>
+      <w:pPr>
+        <w:rPr>
+          <w:b/>
+          <w:bCs/>
+        </w:rPr>
+      </w:pPr>
+      <w:r>
+        <w:rPr>
+          <w:b/>
+          <w:bCs/>
+        </w:rPr>
+        <w:t xml:space="preserve">        FOREIGN KEY (product_id) REFERENCES Products(product_id)</w:t>
+      </w:r>
+    </w:p>
+    <w:p>
+      <w:pPr>
+        <w:rPr>
+          <w:b/>
+          <w:bCs/>
+        </w:rPr>
+      </w:pPr>
+      <w:r>
+        <w:rPr>
+          <w:b/>
+          <w:bCs/>
+        </w:rPr>
+        <w:t xml:space="preserve">    )</w:t>
+      </w:r>
+    </w:p>
+    <w:p>
+      <w:pPr>
+        <w:rPr>
+          <w:b/>
+          <w:bCs/>
+        </w:rPr>
+      </w:pPr>
+      <w:r>
+        <w:rPr>
+          <w:b/>
+          <w:bCs/>
+        </w:rPr>
+        <w:t>""")</w:t>
+      </w:r>
+    </w:p>
+    <w:p>
+      <w:pPr>
+        <w:rPr>
+          <w:b/>
+          <w:bCs/>
+        </w:rPr>
+      </w:pPr>
+    </w:p>
+    <w:p>
+      <w:pPr>
+        <w:rPr>
+          <w:b/>
+          <w:bCs/>
+        </w:rPr>
+      </w:pPr>
+      <w:r>
+        <w:rPr>
+          <w:b/>
+          <w:bCs/>
+        </w:rPr>
+        <w:t>cur.execute("""</w:t>
+      </w:r>
+    </w:p>
+    <w:p>
+      <w:pPr>
+        <w:rPr>
+          <w:b/>
+          <w:bCs/>
+        </w:rPr>
+      </w:pPr>
+      <w:r>
+        <w:rPr>
+          <w:b/>
+          <w:bCs/>
+        </w:rPr>
+        <w:t xml:space="preserve">    CREATE TABLE Transactions (</w:t>
+      </w:r>
+    </w:p>
+    <w:p>
+      <w:pPr>
+        <w:rPr>
+          <w:b/>
+          <w:bCs/>
+        </w:rPr>
+      </w:pPr>
+      <w:r>
+        <w:rPr>
+          <w:b/>
+          <w:bCs/>
+        </w:rPr>
+        <w:t xml:space="preserve">        transaction_id   INTEGER PRIMARY KEY AUTOINCREMENT,</w:t>
+      </w:r>
+    </w:p>
+    <w:p>
+      <w:pPr>
+        <w:rPr>
+          <w:b/>
+          <w:bCs/>
+        </w:rPr>
+      </w:pPr>
+      <w:r>
+        <w:rPr>
+          <w:b/>
+          <w:bCs/>
+        </w:rPr>
+        <w:t xml:space="preserve">        product_id       INT NOT NULL,</w:t>
+      </w:r>
+    </w:p>
+    <w:p>
+      <w:pPr>
+        <w:rPr>
+          <w:b/>
+          <w:bCs/>
+        </w:rPr>
+      </w:pPr>
+      <w:r>
+        <w:rPr>
+          <w:b/>
+          <w:bCs/>
+        </w:rPr>
+        <w:t xml:space="preserve">        transaction_type TEXT CHECK(transaction_type IN ('sale', 'purchase')) NOT NULL,</w:t>
+      </w:r>
+    </w:p>
+    <w:p>
+      <w:pPr>
+        <w:rPr>
+          <w:b/>
+          <w:bCs/>
+        </w:rPr>
+      </w:pPr>
+      <w:r>
+        <w:rPr>
+          <w:b/>
+          <w:bCs/>
+        </w:rPr>
+        <w:t xml:space="preserve">        transaction_date DATE NOT NULL DEFAULT (CURRENT_DATE),</w:t>
+      </w:r>
+    </w:p>
+    <w:p>
+      <w:pPr>
+        <w:rPr>
+          <w:b/>
+          <w:bCs/>
+        </w:rPr>
+      </w:pPr>
+      <w:r>
+        <w:rPr>
+          <w:b/>
+          <w:bCs/>
+        </w:rPr>
+        <w:t xml:space="preserve">        quantity         INT NOT NULL,</w:t>
+      </w:r>
+    </w:p>
+    <w:p>
+      <w:pPr>
+        <w:rPr>
+          <w:b/>
+          <w:bCs/>
+        </w:rPr>
+      </w:pPr>
+      <w:r>
+        <w:rPr>
+          <w:b/>
+          <w:bCs/>
+        </w:rPr>
+        <w:t xml:space="preserve">        FOREIGN KEY (product_id) REFERENCES Products(product_id)</w:t>
+      </w:r>
+    </w:p>
+    <w:p>
+      <w:pPr>
+        <w:rPr>
+          <w:b/>
+          <w:bCs/>
+        </w:rPr>
+      </w:pPr>
+      <w:r>
+        <w:rPr>
+          <w:b/>
+          <w:bCs/>
+        </w:rPr>
+        <w:t xml:space="preserve">    )</w:t>
+      </w:r>
+    </w:p>
+    <w:p>
+      <w:pPr>
+        <w:rPr>
+          <w:b/>
+          <w:bCs/>
+        </w:rPr>
+      </w:pPr>
+      <w:r>
+        <w:rPr>
+          <w:b/>
+          <w:bCs/>
+        </w:rPr>
+        <w:t>""")</w:t>
+      </w:r>
+    </w:p>
+    <w:p>
+      <w:pPr>
+        <w:rPr>
+          <w:b/>
+          <w:bCs/>
+        </w:rPr>
+      </w:pPr>
+    </w:p>
+    <w:p>
+      <w:pPr>
+        <w:rPr>
+          <w:b/>
+          <w:bCs/>
+        </w:rPr>
+      </w:pPr>
+      <w:r>
+        <w:rPr>
+          <w:b/>
+          <w:bCs/>
+        </w:rPr>
+        <w:t>cur.execute("""</w:t>
+      </w:r>
+    </w:p>
+    <w:p>
+      <w:pPr>
+        <w:rPr>
+          <w:b/>
+          <w:bCs/>
+        </w:rPr>
+      </w:pPr>
+      <w:r>
+        <w:rPr>
+          <w:b/>
+          <w:bCs/>
+        </w:rPr>
+        <w:t xml:space="preserve">    CREATE TABLE Weather_Data (</w:t>
+      </w:r>
+    </w:p>
+    <w:p>
+      <w:pPr>
+        <w:rPr>
+          <w:b/>
+          <w:bCs/>
+        </w:rPr>
+      </w:pPr>
+      <w:r>
+        <w:rPr>
+          <w:b/>
+          <w:bCs/>
+        </w:rPr>
+        <w:t xml:space="preserve">        weather_id       INTEGER PRIMARY KEY AUTOINCREMENT,</w:t>
+      </w:r>
+    </w:p>
+    <w:p>
+      <w:pPr>
+        <w:rPr>
+          <w:b/>
+          <w:bCs/>
+        </w:rPr>
+      </w:pPr>
+      <w:r>
+        <w:rPr>
+          <w:b/>
+          <w:bCs/>
+        </w:rPr>
+        <w:t xml:space="preserve">        record_date      DATE NOT NULL UNIQUE,</w:t>
+      </w:r>
+    </w:p>
+    <w:p>
+      <w:pPr>
+        <w:rPr>
+          <w:b/>
+          <w:bCs/>
+        </w:rPr>
+      </w:pPr>
+      <w:r>
+        <w:rPr>
+          <w:b/>
+          <w:bCs/>
+        </w:rPr>
+        <w:t xml:space="preserve">        temp_max_c       DECIMAL(5, 2),</w:t>
+      </w:r>
+    </w:p>
+    <w:p>
+      <w:pPr>
+        <w:rPr>
+          <w:b/>
+          <w:bCs/>
+        </w:rPr>
+      </w:pPr>
+      <w:r>
+        <w:rPr>
+          <w:b/>
+          <w:bCs/>
+        </w:rPr>
+        <w:t xml:space="preserve">        precipitation_mm DECIMAL(5, 2),</w:t>
+      </w:r>
+    </w:p>
+    <w:p>
+      <w:pPr>
+        <w:rPr>
+          <w:b/>
+          <w:bCs/>
+        </w:rPr>
+      </w:pPr>
+      <w:r>
+        <w:rPr>
+          <w:b/>
+          <w:bCs/>
+        </w:rPr>
+        <w:t xml:space="preserve">        rain_mm          DECIMAL(5, 2),</w:t>
+      </w:r>
+    </w:p>
+    <w:p>
+      <w:pPr>
+        <w:rPr>
+          <w:b/>
+          <w:bCs/>
+        </w:rPr>
+      </w:pPr>
+      <w:r>
+        <w:rPr>
+          <w:b/>
+          <w:bCs/>
+        </w:rPr>
+        <w:t xml:space="preserve">        cloud_cover_pct  DECIMAL(5, 2)</w:t>
+      </w:r>
+    </w:p>
+    <w:p>
+      <w:pPr>
+        <w:rPr>
+          <w:b/>
+          <w:bCs/>
+        </w:rPr>
+      </w:pPr>
+      <w:r>
+        <w:rPr>
+          <w:b/>
+          <w:bCs/>
+        </w:rPr>
+        <w:t xml:space="preserve">    )</w:t>
+      </w:r>
+    </w:p>
+    <w:p>
+      <w:pPr>
+        <w:rPr>
+          <w:b/>
+          <w:bCs/>
+        </w:rPr>
+      </w:pPr>
+      <w:r>
+        <w:rPr>
+          <w:b/>
+          <w:bCs/>
+        </w:rPr>
+        <w:t>""")</w:t>
+      </w:r>
+    </w:p>
+    <w:p>
+      <w:pPr>
+        <w:rPr>
+          <w:b/>
+          <w:bCs/>
+        </w:rPr>
+      </w:pPr>
+    </w:p>
+    <w:p>
+      <w:pPr>
+        <w:rPr>
+          <w:b/>
+          <w:bCs/>
+        </w:rPr>
+      </w:pPr>
+      <w:r>
+        <w:rPr>
+          <w:b/>
+          <w:bCs/>
+        </w:rPr>
+        <w:t>connection.commit()</w:t>
+      </w:r>
+    </w:p>
+    <w:p>
+      <w:pPr>
+        <w:rPr>
+          <w:b/>
+          <w:bCs/>
+        </w:rPr>
+      </w:pPr>
+      <w:r>
+        <w:rPr>
+          <w:b/>
+          <w:bCs/>
+        </w:rPr>
+        <w:t>connection.close()</w:t>
+      </w:r>
+    </w:p>
+    <w:p>
+      <w:pPr>
+        <w:rPr>
+          <w:b/>
+          <w:bCs/>
+        </w:rPr>
+      </w:pPr>
+      <w:r>
+        <w:rPr>
+          <w:b/>
+          <w:bCs/>
+        </w:rPr>
+        <w:t>print("inventory.db created successfully.")</w:t>
+      </w:r>
+    </w:p>
     <w:sectPr>
       <w:pgSz w:w="12240" w:h="15840"/>
       <w:pgMar w:top="1440" w:right="1440" w:bottom="1440" w:left="1440" w:header="720" w:footer="720" w:gutter="0"/>
@@ -4908,7 +8409,6 @@
     <w:next w:val="Normal"/>
     <w:link w:val="Heading2Char"/>
     <w:uiPriority w:val="9"/>
-    <w:semiHidden/>
     <w:unhideWhenUsed/>
     <w:qFormat/>
     <w:rsid w:val="00C769B6"/>
@@ -5125,7 +8625,6 @@
     <w:basedOn w:val="DefaultParagraphFont"/>
     <w:link w:val="Heading2"/>
     <w:uiPriority w:val="9"/>
-    <w:semiHidden/>
     <w:rsid w:val="00C769B6"/>
     <w:rPr>
       <w:rFonts w:asciiTheme="majorHAnsi" w:eastAsiaTheme="majorEastAsia" w:hAnsiTheme="majorHAnsi" w:cstheme="majorBidi"/>
@@ -5512,6 +9011,22 @@
       <w14:ligatures w14:val="none"/>
     </w:rPr>
   </w:style>
+  <w:style w:type="paragraph" w:styleId="NormalWeb">
+    <w:name w:val="Normal (Web)"/>
+    <w:basedOn w:val="Normal"/>
+    <w:uiPriority w:val="99"/>
+    <w:semiHidden/>
+    <w:unhideWhenUsed/>
+    <w:rsid w:val="005817FC"/>
+    <w:pPr>
+      <w:spacing w:before="100" w:beforeAutospacing="1" w:after="100" w:afterAutospacing="1" w:line="240" w:lineRule="auto"/>
+    </w:pPr>
+    <w:rPr>
+      <w:rFonts w:ascii="Times New Roman" w:eastAsia="Times New Roman" w:hAnsi="Times New Roman" w:cs="Times New Roman"/>
+      <w:kern w:val="0"/>
+      <w14:ligatures w14:val="none"/>
+    </w:rPr>
+  </w:style>
 </w:styles>
 </file>
 

</xml_diff>